<commit_message>
Prioritize SSJS over CSJS and add a downloadable rules/rubric guide.
Tag server vs client JavaScript distinctly, keep CSJS in inventory as LOW severity with SSJS sorted first, and expose a live Word export of search rules, scoring rubric, and AI inference passes.

Co-authored-by: Cursor <cursoragent@cursor.com>
</commit_message>
<xml_diff>
--- a/docs/Xer_Code_Analysis_Rubric.docx
+++ b/docs/Xer_Code_Analysis_Rubric.docx
@@ -5,34 +5,26 @@
     <w:p>
       <w:pPr>
         <w:pStyle w:val="Title"/>
+        <w:jc w:val="left"/>
       </w:pPr>
       <w:r>
-        <w:t>Xer Code Analysis Rubric</w:t>
+        <w:t>Xer Code Analysis — Rules &amp; Rubric</w:t>
       </w:r>
     </w:p>
     <w:p>
       <w:r>
-        <w:t>Domino DXL Handle, Performance &amp; Memory Quality Auditor</w:t>
+        <w:rPr>
+          <w:b/>
+        </w:rPr>
+        <w:t xml:space="preserve">Generated: </w:t>
+      </w:r>
+      <w:r>
+        <w:t>2026-09-09 18:29 UTC</w:t>
       </w:r>
     </w:p>
     <w:p>
       <w:r>
-        <w:t>This document describes the business rules (static detectors) and AI inference process Xer uses to audit Domino application code extracted from DXL / On-Disk Projects.</w:t>
-      </w:r>
-    </w:p>
-    <w:p>
-      <w:r>
-        <w:t>Generated: 2026-09-04 18:14 UTC</w:t>
-      </w:r>
-    </w:p>
-    <w:p>
-      <w:r>
-        <w:t>Product: Xer (domino_dxl_auditor / Code Analysis tab)</w:t>
-      </w:r>
-    </w:p>
-    <w:p>
-      <w:r>
-        <w:t>Languages in scope: LotusScript, Java (lotus.domino), SSJS / XPages JavaScript</w:t>
+        <w:t>This document is the live catalog of static search rules, scoring rubric, and AI inference passes used by Xer Code Analysis. It is generated from the product rule catalog (not a frozen copy).</w:t>
       </w:r>
     </w:p>
     <w:p>
@@ -40,12 +32,197 @@
         <w:pStyle w:val="Heading1"/>
       </w:pPr>
       <w:r>
-        <w:t>1. Purpose</w:t>
+        <w:t>1. Analysis pipeline</w:t>
+      </w:r>
+    </w:p>
+    <w:p>
+      <w:pPr>
+        <w:pStyle w:val="ListNumber"/>
+      </w:pPr>
+      <w:r>
+        <w:t>Extract Java / SSJS / XPages (and formula) units from the DXL / application graph.</w:t>
+      </w:r>
+    </w:p>
+    <w:p>
+      <w:pPr>
+        <w:pStyle w:val="ListNumber"/>
+      </w:pPr>
+      <w:r>
+        <w:t>Run deterministic static search rules (DOM-*, PERF-*, SEC-*, FORM-*, DOM-OWN-*).</w:t>
+      </w:r>
+    </w:p>
+    <w:p>
+      <w:pPr>
+        <w:pStyle w:val="ListNumber"/>
+      </w:pPr>
+      <w:r>
+        <w:t>Build the Function &amp; Recycle Inventory (handle allocation vs cleanup per function).</w:t>
+      </w:r>
+    </w:p>
+    <w:p>
+      <w:pPr>
+        <w:pStyle w:val="ListNumber"/>
+      </w:pPr>
+      <w:r>
+        <w:t>When OPENAI_API_KEY is set: run AI Pass 1–3 (FP filter, blind spots, ownership).</w:t>
+      </w:r>
+    </w:p>
+    <w:p>
+      <w:pPr>
+        <w:pStyle w:val="ListNumber"/>
+      </w:pPr>
+      <w:r>
+        <w:t>Apply confidence gate (default XER_AI_CONFIDENCE_MIN=75) and human triage overrides.</w:t>
       </w:r>
     </w:p>
     <w:p>
       <w:r>
-        <w:t>Xer evaluates Domino application code for C-API handle leaks, View/NIF performance anti-patterns, and related memory issues that cause handle-table exhaustion, index lock contention, and server instability.</w:t>
+        <w:t>Handle Exhaustion scope is Java / SSJS / XPages only. LotusScript LS-DOM-* detectors remain in the catalog for reference but are not wired into Handle Exhaustion scoring.</w:t>
+      </w:r>
+    </w:p>
+    <w:p>
+      <w:pPr>
+        <w:pStyle w:val="Heading1"/>
+      </w:pPr>
+      <w:r>
+        <w:t>2. Scoring rubric</w:t>
+      </w:r>
+    </w:p>
+    <w:p>
+      <w:pPr>
+        <w:pStyle w:val="Heading2"/>
+      </w:pPr>
+      <w:r>
+        <w:t>Severity</w:t>
+      </w:r>
+    </w:p>
+    <w:tbl>
+      <w:tblPr>
+        <w:tblStyle w:val="TableGrid"/>
+        <w:tblW w:type="auto" w:w="0"/>
+        <w:tblLook w:firstColumn="1" w:firstRow="1" w:lastColumn="0" w:lastRow="0" w:noHBand="0" w:noVBand="1" w:val="04A0"/>
+      </w:tblPr>
+      <w:tblGrid>
+        <w:gridCol w:w="4896"/>
+        <w:gridCol w:w="4896"/>
+      </w:tblGrid>
+      <w:tr>
+        <w:tc>
+          <w:tcPr>
+            <w:tcW w:type="dxa" w:w="4896"/>
+          </w:tcPr>
+          <w:p>
+            <w:r>
+              <w:t>Severity</w:t>
+            </w:r>
+          </w:p>
+        </w:tc>
+        <w:tc>
+          <w:tcPr>
+            <w:tcW w:type="dxa" w:w="4896"/>
+          </w:tcPr>
+          <w:p>
+            <w:r>
+              <w:t>Meaning</w:t>
+            </w:r>
+          </w:p>
+        </w:tc>
+      </w:tr>
+      <w:tr>
+        <w:tc>
+          <w:tcPr>
+            <w:tcW w:type="dxa" w:w="4896"/>
+          </w:tcPr>
+          <w:p>
+            <w:r>
+              <w:t>CRITICAL</w:t>
+            </w:r>
+          </w:p>
+        </w:tc>
+        <w:tc>
+          <w:tcPr>
+            <w:tcW w:type="dxa" w:w="4896"/>
+          </w:tcPr>
+          <w:p>
+            <w:r>
+              <w:t>Handle exhaustion in loops / hot paths; ODA misuse that can stall threads.</w:t>
+            </w:r>
+          </w:p>
+        </w:tc>
+      </w:tr>
+      <w:tr>
+        <w:tc>
+          <w:tcPr>
+            <w:tcW w:type="dxa" w:w="4896"/>
+          </w:tcPr>
+          <w:p>
+            <w:r>
+              <w:t>HIGH</w:t>
+            </w:r>
+          </w:p>
+        </w:tc>
+        <w:tc>
+          <w:tcPr>
+            <w:tcW w:type="dxa" w:w="4896"/>
+          </w:tcPr>
+          <w:p>
+            <w:r>
+              <w:t>Missing recycle scaffolding, conditional cleanup, ownership gaps, NIF/perf risks.</w:t>
+            </w:r>
+          </w:p>
+        </w:tc>
+      </w:tr>
+      <w:tr>
+        <w:tc>
+          <w:tcPr>
+            <w:tcW w:type="dxa" w:w="4896"/>
+          </w:tcPr>
+          <w:p>
+            <w:r>
+              <w:t>MEDIUM</w:t>
+            </w:r>
+          </w:p>
+        </w:tc>
+        <w:tc>
+          <w:tcPr>
+            <w:tcW w:type="dxa" w:w="4896"/>
+          </w:tcPr>
+          <w:p>
+            <w:r>
+              <w:t>Hygiene or expensive patterns that are less likely to exhaust the handle table.</w:t>
+            </w:r>
+          </w:p>
+        </w:tc>
+      </w:tr>
+      <w:tr>
+        <w:tc>
+          <w:tcPr>
+            <w:tcW w:type="dxa" w:w="4896"/>
+          </w:tcPr>
+          <w:p>
+            <w:r>
+              <w:t>LOW</w:t>
+            </w:r>
+          </w:p>
+        </w:tc>
+        <w:tc>
+          <w:tcPr>
+            <w:tcW w:type="dxa" w:w="4896"/>
+          </w:tcPr>
+          <w:p>
+            <w:r>
+              <w:t>One-shot / non-loop hygiene (often demoted by AI VERIFIED_NON_LOOP).</w:t>
+            </w:r>
+          </w:p>
+        </w:tc>
+      </w:tr>
+    </w:tbl>
+    <w:p>
+      <w:pPr>
+        <w:pStyle w:val="Heading2"/>
+      </w:pPr>
+      <w:r>
+        <w:t>Inventory statuses</w:t>
       </w:r>
     </w:p>
     <w:p>
@@ -53,7 +230,7 @@
         <w:pStyle w:val="ListBullet"/>
       </w:pPr>
       <w:r>
-        <w:t>Flag vulnerability instances (DOM-*, LS-DOM-*, PERF-* rules).</w:t>
+        <w:t>SAFE_NO_HANDLES — no Domino allocation signals in the function.</w:t>
       </w:r>
     </w:p>
     <w:p>
@@ -61,7 +238,7 @@
         <w:pStyle w:val="ListBullet"/>
       </w:pPr>
       <w:r>
-        <w:t>Inventory every function/sub and measure handle safety / recycle coverage.</w:t>
+        <w:t>PROTECTED — allocates and has matching .recycle() / Delete cleanup.</w:t>
       </w:r>
     </w:p>
     <w:p>
@@ -69,7 +246,47 @@
         <w:pStyle w:val="ListBullet"/>
       </w:pPr>
       <w:r>
-        <w:t>Optionally cross-validate with AI (three passes) to demote false positives, discover blind spots, and assign cross-module handle ownership.</w:t>
+        <w:t>PARTIAL_CLEANUP / CONDITIONAL_CLEANUP / ESCAPE_PATH_GAP — incomplete cleanup paths.</w:t>
+      </w:r>
+    </w:p>
+    <w:p>
+      <w:pPr>
+        <w:pStyle w:val="ListBullet"/>
+      </w:pPr>
+      <w:r>
+        <w:t>UNPROTECTED_ALLOCATION — allocates with no explicit cleanup.</w:t>
+      </w:r>
+    </w:p>
+    <w:p>
+      <w:pPr>
+        <w:pStyle w:val="Heading2"/>
+      </w:pPr>
+      <w:r>
+        <w:t>Key metrics</w:t>
+      </w:r>
+    </w:p>
+    <w:p>
+      <w:pPr>
+        <w:pStyle w:val="ListBullet"/>
+      </w:pPr>
+      <w:r>
+        <w:t>Handle safety rate = (safe + fully protected) / Java-JS functions scanned.</w:t>
+      </w:r>
+    </w:p>
+    <w:p>
+      <w:pPr>
+        <w:pStyle w:val="ListBullet"/>
+      </w:pPr>
+      <w:r>
+        <w:t>Recycle coverage among allocators = share of allocating functions that actually clean up.</w:t>
+      </w:r>
+    </w:p>
+    <w:p>
+      <w:pPr>
+        <w:pStyle w:val="ListBullet"/>
+      </w:pPr>
+      <w:r>
+        <w:t>Allocation inside a collection loop → CRITICAL; one-shot helpers → LOW/MEDIUM hygiene.</w:t>
       </w:r>
     </w:p>
     <w:p>
@@ -77,176 +294,12 @@
         <w:pStyle w:val="Heading1"/>
       </w:pPr>
       <w:r>
-        <w:t>2. Analysis pipeline</w:t>
+        <w:t>3. Static search rules</w:t>
       </w:r>
     </w:p>
     <w:p>
       <w:r>
-        <w:t>When a graph is audited (UI Code Analysis, API /code-audit, or CLI domino_dxl_auditor.py):</w:t>
-      </w:r>
-    </w:p>
-    <w:p>
-      <w:pPr>
-        <w:pStyle w:val="ListBullet"/>
-      </w:pPr>
-      <w:r>
-        <w:t>Extract code blocks from stored DXL / application graph (agents, script libraries, form events, Java).</w:t>
-      </w:r>
-    </w:p>
-    <w:p>
-      <w:pPr>
-        <w:pStyle w:val="ListBullet"/>
-      </w:pPr>
-      <w:r>
-        <w:t>Pre-filter blocks that mention Domino APIs (session, Document, recycle, Notes*, ViewNavigator, etc.).</w:t>
-      </w:r>
-    </w:p>
-    <w:p>
-      <w:pPr>
-        <w:pStyle w:val="ListBullet"/>
-      </w:pPr>
-      <w:r>
-        <w:t>Run deterministic rule engines: Java/SSJS DOM-001…016, LotusScript LS-DOM-001…008, Performance PERF-001…003.</w:t>
-      </w:r>
-    </w:p>
-    <w:p>
-      <w:pPr>
-        <w:pStyle w:val="ListBullet"/>
-      </w:pPr>
-      <w:r>
-        <w:t>Build Function &amp; Recycle Inventory (SAFE / PROTECTED / UNPROTECTED).</w:t>
-      </w:r>
-    </w:p>
-    <w:p>
-      <w:pPr>
-        <w:pStyle w:val="ListBullet"/>
-      </w:pPr>
-      <w:r>
-        <w:t>If --llm / ?llm=true and OPENAI_API_KEY is set: AI Pass 1 (FP filter) + Pass 2 (blind spots) + Pass 3 (cross-module ownership / severity escalation).</w:t>
-      </w:r>
-    </w:p>
-    <w:p>
-      <w:pPr>
-        <w:pStyle w:val="ListBullet"/>
-      </w:pPr>
-      <w:r>
-        <w:t>Emit findings with As-Is snippets, language-aware To-Be templates, performance impact callouts, and plain-English guides.</w:t>
-      </w:r>
-    </w:p>
-    <w:p>
-      <w:pPr>
-        <w:pStyle w:val="Heading1"/>
-      </w:pPr>
-      <w:r>
-        <w:t>3. Scoring concepts shown in the UI</w:t>
-      </w:r>
-    </w:p>
-    <w:p>
-      <w:pPr>
-        <w:pStyle w:val="Heading2"/>
-      </w:pPr>
-      <w:r>
-        <w:t>3.1 Handle Safety Rate (primary ring)</w:t>
-      </w:r>
-    </w:p>
-    <w:p>
-      <w:r>
-        <w:t>Share of all scanned functions that are not an unprotected leak risk: (Safe-no-handles + With-cleanup) ÷ Scanned.</w:t>
-      </w:r>
-    </w:p>
-    <w:p>
-      <w:pPr>
-        <w:pStyle w:val="Heading2"/>
-      </w:pPr>
-      <w:r>
-        <w:t>3.2 Recycle coverage among allocators (secondary)</w:t>
-      </w:r>
-    </w:p>
-    <w:p>
-      <w:r>
-        <w:t>Of functions that allocate Domino handles, what share call Delete / .recycle(): With-cleanup ÷ Allocators.</w:t>
-      </w:r>
-    </w:p>
-    <w:p>
-      <w:pPr>
-        <w:pStyle w:val="Heading2"/>
-      </w:pPr>
-      <w:r>
-        <w:t>3.3 Function status classification</w:t>
-      </w:r>
-    </w:p>
-    <w:p>
-      <w:pPr>
-        <w:pStyle w:val="ListBullet"/>
-      </w:pPr>
-      <w:r>
-        <w:t>SAFE_NO_HANDLES — body does not show Domino handle allocation keywords.</w:t>
-      </w:r>
-    </w:p>
-    <w:p>
-      <w:pPr>
-        <w:pStyle w:val="ListBullet"/>
-      </w:pPr>
-      <w:r>
-        <w:t>PROTECTED — allocates handles AND contains ≥1 Delete / Call x.Recycle() / .recycle().</w:t>
-      </w:r>
-    </w:p>
-    <w:p>
-      <w:pPr>
-        <w:pStyle w:val="ListBullet"/>
-      </w:pPr>
-      <w:r>
-        <w:t>UNPROTECTED_ALLOCATION — allocates handles with 0 explicit cleanup calls.</w:t>
-      </w:r>
-    </w:p>
-    <w:p>
-      <w:pPr>
-        <w:pStyle w:val="Heading2"/>
-      </w:pPr>
-      <w:r>
-        <w:t>3.4 Findings table category filters</w:t>
-      </w:r>
-    </w:p>
-    <w:p>
-      <w:r>
-        <w:t>Code Analysis findings can be filtered by category tags:</w:t>
-      </w:r>
-    </w:p>
-    <w:p>
-      <w:pPr>
-        <w:pStyle w:val="ListBullet"/>
-      </w:pPr>
-      <w:r>
-        <w:t>Handle Leaks — DOM-* / LS-DOM-* static lifecycle findings.</w:t>
-      </w:r>
-    </w:p>
-    <w:p>
-      <w:pPr>
-        <w:pStyle w:val="ListBullet"/>
-      </w:pPr>
-      <w:r>
-        <w:t>Performance &amp; NIF — PERF-001…003 view index and I/O anti-patterns.</w:t>
-      </w:r>
-    </w:p>
-    <w:p>
-      <w:pPr>
-        <w:pStyle w:val="ListBullet"/>
-      </w:pPr>
-      <w:r>
-        <w:t>AI Discovered — DOM-BS-* blind spots and cross-function ownership gaps.</w:t>
-      </w:r>
-    </w:p>
-    <w:p>
-      <w:pPr>
-        <w:pStyle w:val="Heading1"/>
-      </w:pPr>
-      <w:r>
-        <w:t>4. Static rule catalog (deterministic)</w:t>
-      </w:r>
-    </w:p>
-    <w:p>
-      <w:r>
-        <w:t>Rules are regex/heuristic detectors. They do not execute code. Severity defaults are shown below; AI Pass 3 may escalate severity when a leak sits on a scheduled/background hot path.</w:t>
+        <w:t>Deterministic detectors (regex / AST-light heuristics). Each finding cites a rule id.</w:t>
       </w:r>
     </w:p>
     <w:p>
@@ -264,25 +317,35 @@
         <w:tblLook w:firstColumn="1" w:firstRow="1" w:lastColumn="0" w:lastRow="0" w:noHBand="0" w:noVBand="1" w:val="04A0"/>
       </w:tblPr>
       <w:tblGrid>
-        <w:gridCol w:w="2160"/>
-        <w:gridCol w:w="2160"/>
-        <w:gridCol w:w="2160"/>
-        <w:gridCol w:w="2160"/>
+        <w:gridCol w:w="2448"/>
+        <w:gridCol w:w="2448"/>
+        <w:gridCol w:w="2448"/>
+        <w:gridCol w:w="2448"/>
       </w:tblGrid>
       <w:tr>
         <w:tc>
           <w:tcPr>
-            <w:tcW w:type="dxa" w:w="2160"/>
+            <w:tcW w:type="dxa" w:w="2448"/>
           </w:tcPr>
           <w:p>
             <w:r>
-              <w:t>Rule ID</w:t>
+              <w:t>ID</w:t>
             </w:r>
           </w:p>
         </w:tc>
         <w:tc>
           <w:tcPr>
-            <w:tcW w:type="dxa" w:w="2160"/>
+            <w:tcW w:type="dxa" w:w="2448"/>
+          </w:tcPr>
+          <w:p>
+            <w:r>
+              <w:t>Default sev</w:t>
+            </w:r>
+          </w:p>
+        </w:tc>
+        <w:tc>
+          <w:tcPr>
+            <w:tcW w:type="dxa" w:w="2448"/>
           </w:tcPr>
           <w:p>
             <w:r>
@@ -292,21 +355,11 @@
         </w:tc>
         <w:tc>
           <w:tcPr>
-            <w:tcW w:type="dxa" w:w="2160"/>
+            <w:tcW w:type="dxa" w:w="2448"/>
           </w:tcPr>
           <w:p>
             <w:r>
-              <w:t>Default severity</w:t>
-            </w:r>
-          </w:p>
-        </w:tc>
-        <w:tc>
-          <w:tcPr>
-            <w:tcW w:type="dxa" w:w="2160"/>
-          </w:tcPr>
-          <w:p>
-            <w:r>
-              <w:t>Detection summary</w:t>
+              <w:t>What it searches for</w:t>
             </w:r>
           </w:p>
         </w:tc>
@@ -314,7 +367,7 @@
       <w:tr>
         <w:tc>
           <w:tcPr>
-            <w:tcW w:type="dxa" w:w="2160"/>
+            <w:tcW w:type="dxa" w:w="2448"/>
           </w:tcPr>
           <w:p>
             <w:r>
@@ -324,7 +377,17 @@
         </w:tc>
         <w:tc>
           <w:tcPr>
-            <w:tcW w:type="dxa" w:w="2160"/>
+            <w:tcW w:type="dxa" w:w="2448"/>
+          </w:tcPr>
+          <w:p>
+            <w:r>
+              <w:t>CRITICAL</w:t>
+            </w:r>
+          </w:p>
+        </w:tc>
+        <w:tc>
+          <w:tcPr>
+            <w:tcW w:type="dxa" w:w="2448"/>
           </w:tcPr>
           <w:p>
             <w:r>
@@ -334,7 +397,29 @@
         </w:tc>
         <w:tc>
           <w:tcPr>
-            <w:tcW w:type="dxa" w:w="2160"/>
+            <w:tcW w:type="dxa" w:w="2448"/>
+          </w:tcPr>
+          <w:p>
+            <w:r>
+              <w:t>A Domino object is created and immediately chained (for example `session.createDateTime(...).getDateOnly()`). The temporary handle is never assigned to a variable, so it cannot be released and leaks native C-API memory.</w:t>
+            </w:r>
+          </w:p>
+        </w:tc>
+      </w:tr>
+      <w:tr>
+        <w:tc>
+          <w:tcPr>
+            <w:tcW w:type="dxa" w:w="2448"/>
+          </w:tcPr>
+          <w:p>
+            <w:r>
+              <w:t>DOM-002</w:t>
+            </w:r>
+          </w:p>
+        </w:tc>
+        <w:tc>
+          <w:tcPr>
+            <w:tcW w:type="dxa" w:w="2448"/>
           </w:tcPr>
           <w:p>
             <w:r>
@@ -344,29 +429,7 @@
         </w:tc>
         <w:tc>
           <w:tcPr>
-            <w:tcW w:type="dxa" w:w="2160"/>
-          </w:tcPr>
-          <w:p>
-            <w:r>
-              <w:t>Inline chained Domino construction such as session.getDatabase(...).getView(...) without intermediate handles/recycle.</w:t>
-            </w:r>
-          </w:p>
-        </w:tc>
-      </w:tr>
-      <w:tr>
-        <w:tc>
-          <w:tcPr>
-            <w:tcW w:type="dxa" w:w="2160"/>
-          </w:tcPr>
-          <w:p>
-            <w:r>
-              <w:t>DOM-002</w:t>
-            </w:r>
-          </w:p>
-        </w:tc>
-        <w:tc>
-          <w:tcPr>
-            <w:tcW w:type="dxa" w:w="2160"/>
+            <w:tcW w:type="dxa" w:w="2448"/>
           </w:tcPr>
           <w:p>
             <w:r>
@@ -376,7 +439,113 @@
         </w:tc>
         <w:tc>
           <w:tcPr>
-            <w:tcW w:type="dxa" w:w="2160"/>
+            <w:tcW w:type="dxa" w:w="2448"/>
+          </w:tcPr>
+          <w:p>
+            <w:r>
+              <w:t>A collection loop advances with `GetNextDocument` / `getNextDocument` but never releases the previous document handle. Each iteration leaves one native handle open until the HTTP/agent thread dies.</w:t>
+            </w:r>
+          </w:p>
+        </w:tc>
+      </w:tr>
+      <w:tr>
+        <w:tc>
+          <w:tcPr>
+            <w:tcW w:type="dxa" w:w="2448"/>
+          </w:tcPr>
+          <w:p>
+            <w:r>
+              <w:t>DOM-003</w:t>
+            </w:r>
+          </w:p>
+        </w:tc>
+        <w:tc>
+          <w:tcPr>
+            <w:tcW w:type="dxa" w:w="2448"/>
+          </w:tcPr>
+          <w:p>
+            <w:r>
+              <w:t>HIGH</w:t>
+            </w:r>
+          </w:p>
+        </w:tc>
+        <w:tc>
+          <w:tcPr>
+            <w:tcW w:type="dxa" w:w="2448"/>
+          </w:tcPr>
+          <w:p>
+            <w:r>
+              <w:t>Missing try-finally Recycling Scaffolding</w:t>
+            </w:r>
+          </w:p>
+        </w:tc>
+        <w:tc>
+          <w:tcPr>
+            <w:tcW w:type="dxa" w:w="2448"/>
+          </w:tcPr>
+          <w:p>
+            <w:r>
+              <w:t>Native Domino objects are allocated without a guaranteed cleanup path. If an error occurs mid-method, handles remain pinned on the thread.</w:t>
+            </w:r>
+          </w:p>
+        </w:tc>
+      </w:tr>
+      <w:tr>
+        <w:tc>
+          <w:tcPr>
+            <w:tcW w:type="dxa" w:w="2448"/>
+          </w:tcPr>
+          <w:p>
+            <w:r>
+              <w:t>DOM-010</w:t>
+            </w:r>
+          </w:p>
+        </w:tc>
+        <w:tc>
+          <w:tcPr>
+            <w:tcW w:type="dxa" w:w="2448"/>
+          </w:tcPr>
+          <w:p>
+            <w:r>
+              <w:t>HIGH</w:t>
+            </w:r>
+          </w:p>
+        </w:tc>
+        <w:tc>
+          <w:tcPr>
+            <w:tcW w:type="dxa" w:w="2448"/>
+          </w:tcPr>
+          <w:p>
+            <w:r>
+              <w:t>Missing Try-Finally Recycling Block</w:t>
+            </w:r>
+          </w:p>
+        </w:tc>
+        <w:tc>
+          <w:tcPr>
+            <w:tcW w:type="dxa" w:w="2448"/>
+          </w:tcPr>
+          <w:p>
+            <w:r>
+              <w:t>A Domino object is created/acquired without `try`/`finally` recycle scaffolding, so exceptions skip cleanup and leak C-API handles.</w:t>
+            </w:r>
+          </w:p>
+        </w:tc>
+      </w:tr>
+      <w:tr>
+        <w:tc>
+          <w:tcPr>
+            <w:tcW w:type="dxa" w:w="2448"/>
+          </w:tcPr>
+          <w:p>
+            <w:r>
+              <w:t>DOM-011</w:t>
+            </w:r>
+          </w:p>
+        </w:tc>
+        <w:tc>
+          <w:tcPr>
+            <w:tcW w:type="dxa" w:w="2448"/>
           </w:tcPr>
           <w:p>
             <w:r>
@@ -386,11 +555,21 @@
         </w:tc>
         <w:tc>
           <w:tcPr>
-            <w:tcW w:type="dxa" w:w="2160"/>
+            <w:tcW w:type="dxa" w:w="2448"/>
           </w:tcPr>
           <w:p>
             <w:r>
-              <w:t>Java/SSJS loop with getNextDocument/getNextEntry and no recycle of the walked document/entry.</w:t>
+              <w:t>Orphaned Child Handle / Early Parent Recycling</w:t>
+            </w:r>
+          </w:p>
+        </w:tc>
+        <w:tc>
+          <w:tcPr>
+            <w:tcW w:type="dxa" w:w="2448"/>
+          </w:tcPr>
+          <w:p>
+            <w:r>
+              <w:t>A parent View/Database/Collection is recycled while child Document/ViewEntry handles from that parent may still be referenced — orphaning those children in native memory.</w:t>
             </w:r>
           </w:p>
         </w:tc>
@@ -398,27 +577,17 @@
       <w:tr>
         <w:tc>
           <w:tcPr>
-            <w:tcW w:type="dxa" w:w="2160"/>
+            <w:tcW w:type="dxa" w:w="2448"/>
           </w:tcPr>
           <w:p>
             <w:r>
-              <w:t>DOM-003</w:t>
+              <w:t>DOM-012</w:t>
             </w:r>
           </w:p>
         </w:tc>
         <w:tc>
           <w:tcPr>
-            <w:tcW w:type="dxa" w:w="2160"/>
-          </w:tcPr>
-          <w:p>
-            <w:r>
-              <w:t>Missing try-finally Recycling Scaffolding</w:t>
-            </w:r>
-          </w:p>
-        </w:tc>
-        <w:tc>
-          <w:tcPr>
-            <w:tcW w:type="dxa" w:w="2160"/>
+            <w:tcW w:type="dxa" w:w="2448"/>
           </w:tcPr>
           <w:p>
             <w:r>
@@ -428,11 +597,21 @@
         </w:tc>
         <w:tc>
           <w:tcPr>
-            <w:tcW w:type="dxa" w:w="2160"/>
+            <w:tcW w:type="dxa" w:w="2448"/>
           </w:tcPr>
           <w:p>
             <w:r>
-              <w:t>Handle allocation without try/finally recycle scaffolding.</w:t>
+              <w:t>Conditional or Incomplete Loop Recycling</w:t>
+            </w:r>
+          </w:p>
+        </w:tc>
+        <w:tc>
+          <w:tcPr>
+            <w:tcW w:type="dxa" w:w="2448"/>
+          </w:tcPr>
+          <w:p>
+            <w:r>
+              <w:t>`.recycle()` / handle release is inside an `If` inside a loop, so some iterations skip cleanup and leave handles open.</w:t>
             </w:r>
           </w:p>
         </w:tc>
@@ -440,27 +619,59 @@
       <w:tr>
         <w:tc>
           <w:tcPr>
-            <w:tcW w:type="dxa" w:w="2160"/>
+            <w:tcW w:type="dxa" w:w="2448"/>
           </w:tcPr>
           <w:p>
             <w:r>
-              <w:t>DOM-010</w:t>
+              <w:t>DOM-013</w:t>
             </w:r>
           </w:p>
         </w:tc>
         <w:tc>
           <w:tcPr>
-            <w:tcW w:type="dxa" w:w="2160"/>
+            <w:tcW w:type="dxa" w:w="2448"/>
           </w:tcPr>
           <w:p>
             <w:r>
-              <w:t>Missing Try-Finally Recycling Block</w:t>
+              <w:t>MEDIUM</w:t>
             </w:r>
           </w:p>
         </w:tc>
         <w:tc>
           <w:tcPr>
-            <w:tcW w:type="dxa" w:w="2160"/>
+            <w:tcW w:type="dxa" w:w="2448"/>
+          </w:tcPr>
+          <w:p>
+            <w:r>
+              <w:t>Unsafe Object Re-assignment</w:t>
+            </w:r>
+          </w:p>
+        </w:tc>
+        <w:tc>
+          <w:tcPr>
+            <w:tcW w:type="dxa" w:w="2448"/>
+          </w:tcPr>
+          <w:p>
+            <w:r>
+              <w:t>The loop variable is re-assigned with `GetNextDocument(doc)` / `getNextDocument(doc)` without releasing the previous handle first, dropping the only reference to it.</w:t>
+            </w:r>
+          </w:p>
+        </w:tc>
+      </w:tr>
+      <w:tr>
+        <w:tc>
+          <w:tcPr>
+            <w:tcW w:type="dxa" w:w="2448"/>
+          </w:tcPr>
+          <w:p>
+            <w:r>
+              <w:t>DOM-014</w:t>
+            </w:r>
+          </w:p>
+        </w:tc>
+        <w:tc>
+          <w:tcPr>
+            <w:tcW w:type="dxa" w:w="2448"/>
           </w:tcPr>
           <w:p>
             <w:r>
@@ -470,11 +681,21 @@
         </w:tc>
         <w:tc>
           <w:tcPr>
-            <w:tcW w:type="dxa" w:w="2160"/>
+            <w:tcW w:type="dxa" w:w="2448"/>
           </w:tcPr>
           <w:p>
             <w:r>
-              <w:t>Missing try/finally recycling block around Domino handle work.</w:t>
+              <w:t>Un-Recycled Item &amp; MIME Handles</w:t>
+            </w:r>
+          </w:p>
+        </w:tc>
+        <w:tc>
+          <w:tcPr>
+            <w:tcW w:type="dxa" w:w="2448"/>
+          </w:tcPr>
+          <w:p>
+            <w:r>
+              <w:t>An Item, MIMEEntity, or RichTextItem handle is acquired (getFirstItem / getMIMEEntity / createRichTextItem) without a matching recycle/Delete — native C-API memory leaks.</w:t>
             </w:r>
           </w:p>
         </w:tc>
@@ -482,27 +703,17 @@
       <w:tr>
         <w:tc>
           <w:tcPr>
-            <w:tcW w:type="dxa" w:w="2160"/>
+            <w:tcW w:type="dxa" w:w="2448"/>
           </w:tcPr>
           <w:p>
             <w:r>
-              <w:t>DOM-011</w:t>
+              <w:t>DOM-015</w:t>
             </w:r>
           </w:p>
         </w:tc>
         <w:tc>
           <w:tcPr>
-            <w:tcW w:type="dxa" w:w="2160"/>
-          </w:tcPr>
-          <w:p>
-            <w:r>
-              <w:t>Orphaned Child Handle / Early Parent Recycling</w:t>
-            </w:r>
-          </w:p>
-        </w:tc>
-        <w:tc>
-          <w:tcPr>
-            <w:tcW w:type="dxa" w:w="2160"/>
+            <w:tcW w:type="dxa" w:w="2448"/>
           </w:tcPr>
           <w:p>
             <w:r>
@@ -512,11 +723,21 @@
         </w:tc>
         <w:tc>
           <w:tcPr>
-            <w:tcW w:type="dxa" w:w="2160"/>
+            <w:tcW w:type="dxa" w:w="2448"/>
           </w:tcPr>
           <w:p>
             <w:r>
-              <w:t>Orphaned child handle or early parent recycling.</w:t>
+              <w:t>Un-Recycled ViewNavigator / ViewEntryCollection</w:t>
+            </w:r>
+          </w:p>
+        </w:tc>
+        <w:tc>
+          <w:tcPr>
+            <w:tcW w:type="dxa" w:w="2448"/>
+          </w:tcPr>
+          <w:p>
+            <w:r>
+              <w:t>A ViewNavigator or ViewEntryCollection is created without recycle — NIF locks and handles linger.</w:t>
             </w:r>
           </w:p>
         </w:tc>
@@ -524,27 +745,17 @@
       <w:tr>
         <w:tc>
           <w:tcPr>
-            <w:tcW w:type="dxa" w:w="2160"/>
+            <w:tcW w:type="dxa" w:w="2448"/>
           </w:tcPr>
           <w:p>
             <w:r>
-              <w:t>DOM-012</w:t>
+              <w:t>DOM-016</w:t>
             </w:r>
           </w:p>
         </w:tc>
         <w:tc>
           <w:tcPr>
-            <w:tcW w:type="dxa" w:w="2160"/>
-          </w:tcPr>
-          <w:p>
-            <w:r>
-              <w:t>Conditional or Incomplete Loop Recycling</w:t>
-            </w:r>
-          </w:p>
-        </w:tc>
-        <w:tc>
-          <w:tcPr>
-            <w:tcW w:type="dxa" w:w="2160"/>
+            <w:tcW w:type="dxa" w:w="2448"/>
           </w:tcPr>
           <w:p>
             <w:r>
@@ -554,155 +765,7 @@
         </w:tc>
         <w:tc>
           <w:tcPr>
-            <w:tcW w:type="dxa" w:w="2160"/>
-          </w:tcPr>
-          <w:p>
-            <w:r>
-              <w:t>Conditional or incomplete loop recycling.</w:t>
-            </w:r>
-          </w:p>
-        </w:tc>
-      </w:tr>
-      <w:tr>
-        <w:tc>
-          <w:tcPr>
-            <w:tcW w:type="dxa" w:w="2160"/>
-          </w:tcPr>
-          <w:p>
-            <w:r>
-              <w:t>DOM-013</w:t>
-            </w:r>
-          </w:p>
-        </w:tc>
-        <w:tc>
-          <w:tcPr>
-            <w:tcW w:type="dxa" w:w="2160"/>
-          </w:tcPr>
-          <w:p>
-            <w:r>
-              <w:t>Unsafe Object Re-assignment</w:t>
-            </w:r>
-          </w:p>
-        </w:tc>
-        <w:tc>
-          <w:tcPr>
-            <w:tcW w:type="dxa" w:w="2160"/>
-          </w:tcPr>
-          <w:p>
-            <w:r>
-              <w:t>MEDIUM</w:t>
-            </w:r>
-          </w:p>
-        </w:tc>
-        <w:tc>
-          <w:tcPr>
-            <w:tcW w:type="dxa" w:w="2160"/>
-          </w:tcPr>
-          <w:p>
-            <w:r>
-              <w:t>Unsafe object re-assignment without releasing the prior handle.</w:t>
-            </w:r>
-          </w:p>
-        </w:tc>
-      </w:tr>
-      <w:tr>
-        <w:tc>
-          <w:tcPr>
-            <w:tcW w:type="dxa" w:w="2160"/>
-          </w:tcPr>
-          <w:p>
-            <w:r>
-              <w:t>DOM-014</w:t>
-            </w:r>
-          </w:p>
-        </w:tc>
-        <w:tc>
-          <w:tcPr>
-            <w:tcW w:type="dxa" w:w="2160"/>
-          </w:tcPr>
-          <w:p>
-            <w:r>
-              <w:t>Un-Recycled Item &amp; MIME Handles</w:t>
-            </w:r>
-          </w:p>
-        </w:tc>
-        <w:tc>
-          <w:tcPr>
-            <w:tcW w:type="dxa" w:w="2160"/>
-          </w:tcPr>
-          <w:p>
-            <w:r>
-              <w:t>HIGH</w:t>
-            </w:r>
-          </w:p>
-        </w:tc>
-        <w:tc>
-          <w:tcPr>
-            <w:tcW w:type="dxa" w:w="2160"/>
-          </w:tcPr>
-          <w:p>
-            <w:r>
-              <w:t>doc.getFirstItem / getMIMEEntity / createRichTextItem without corresponding .recycle().</w:t>
-            </w:r>
-          </w:p>
-        </w:tc>
-      </w:tr>
-      <w:tr>
-        <w:tc>
-          <w:tcPr>
-            <w:tcW w:type="dxa" w:w="2160"/>
-          </w:tcPr>
-          <w:p>
-            <w:r>
-              <w:t>DOM-015</w:t>
-            </w:r>
-          </w:p>
-        </w:tc>
-        <w:tc>
-          <w:tcPr>
-            <w:tcW w:type="dxa" w:w="2160"/>
-          </w:tcPr>
-          <w:p>
-            <w:r>
-              <w:t>Un-Recycled ViewNavigator / ViewEntryCollection</w:t>
-            </w:r>
-          </w:p>
-        </w:tc>
-        <w:tc>
-          <w:tcPr>
-            <w:tcW w:type="dxa" w:w="2160"/>
-          </w:tcPr>
-          <w:p>
-            <w:r>
-              <w:t>CRITICAL</w:t>
-            </w:r>
-          </w:p>
-        </w:tc>
-        <w:tc>
-          <w:tcPr>
-            <w:tcW w:type="dxa" w:w="2160"/>
-          </w:tcPr>
-          <w:p>
-            <w:r>
-              <w:t>NotesViewNavigator / ViewEntryCollection created without explicit cleanup (index locks / handle exhaustion).</w:t>
-            </w:r>
-          </w:p>
-        </w:tc>
-      </w:tr>
-      <w:tr>
-        <w:tc>
-          <w:tcPr>
-            <w:tcW w:type="dxa" w:w="2160"/>
-          </w:tcPr>
-          <w:p>
-            <w:r>
-              <w:t>DOM-016</w:t>
-            </w:r>
-          </w:p>
-        </w:tc>
-        <w:tc>
-          <w:tcPr>
-            <w:tcW w:type="dxa" w:w="2160"/>
+            <w:tcW w:type="dxa" w:w="2448"/>
           </w:tcPr>
           <w:p>
             <w:r>
@@ -712,21 +775,11 @@
         </w:tc>
         <w:tc>
           <w:tcPr>
-            <w:tcW w:type="dxa" w:w="2160"/>
+            <w:tcW w:type="dxa" w:w="2448"/>
           </w:tcPr>
           <w:p>
             <w:r>
-              <w:t>HIGH</w:t>
-            </w:r>
-          </w:p>
-        </w:tc>
-        <w:tc>
-          <w:tcPr>
-            <w:tcW w:type="dxa" w:w="2160"/>
-          </w:tcPr>
-          <w:p>
-            <w:r>
-              <w:t>db.search / db.FTSearch inside loops without recycling the returned collection.</w:t>
+              <w:t>db.search / FTSearch inside a loop returns a collection that is never recycled.</w:t>
             </w:r>
           </w:p>
         </w:tc>
@@ -738,7 +791,7 @@
         <w:pStyle w:val="Heading2"/>
       </w:pPr>
       <w:r>
-        <w:t>LotusScript Handle Lifecycle</w:t>
+        <w:t>Handle Ownership</w:t>
       </w:r>
     </w:p>
     <w:tbl>
@@ -748,25 +801,35 @@
         <w:tblLook w:firstColumn="1" w:firstRow="1" w:lastColumn="0" w:lastRow="0" w:noHBand="0" w:noVBand="1" w:val="04A0"/>
       </w:tblPr>
       <w:tblGrid>
-        <w:gridCol w:w="2160"/>
-        <w:gridCol w:w="2160"/>
-        <w:gridCol w:w="2160"/>
-        <w:gridCol w:w="2160"/>
+        <w:gridCol w:w="2448"/>
+        <w:gridCol w:w="2448"/>
+        <w:gridCol w:w="2448"/>
+        <w:gridCol w:w="2448"/>
       </w:tblGrid>
       <w:tr>
         <w:tc>
           <w:tcPr>
-            <w:tcW w:type="dxa" w:w="2160"/>
+            <w:tcW w:type="dxa" w:w="2448"/>
           </w:tcPr>
           <w:p>
             <w:r>
-              <w:t>Rule ID</w:t>
+              <w:t>ID</w:t>
             </w:r>
           </w:p>
         </w:tc>
         <w:tc>
           <w:tcPr>
-            <w:tcW w:type="dxa" w:w="2160"/>
+            <w:tcW w:type="dxa" w:w="2448"/>
+          </w:tcPr>
+          <w:p>
+            <w:r>
+              <w:t>Default sev</w:t>
+            </w:r>
+          </w:p>
+        </w:tc>
+        <w:tc>
+          <w:tcPr>
+            <w:tcW w:type="dxa" w:w="2448"/>
           </w:tcPr>
           <w:p>
             <w:r>
@@ -776,21 +839,11 @@
         </w:tc>
         <w:tc>
           <w:tcPr>
-            <w:tcW w:type="dxa" w:w="2160"/>
+            <w:tcW w:type="dxa" w:w="2448"/>
           </w:tcPr>
           <w:p>
             <w:r>
-              <w:t>Default severity</w:t>
-            </w:r>
-          </w:p>
-        </w:tc>
-        <w:tc>
-          <w:tcPr>
-            <w:tcW w:type="dxa" w:w="2160"/>
-          </w:tcPr>
-          <w:p>
-            <w:r>
-              <w:t>Detection summary</w:t>
+              <w:t>What it searches for</w:t>
             </w:r>
           </w:p>
         </w:tc>
@@ -798,27 +851,123 @@
       <w:tr>
         <w:tc>
           <w:tcPr>
-            <w:tcW w:type="dxa" w:w="2160"/>
+            <w:tcW w:type="dxa" w:w="2448"/>
           </w:tcPr>
           <w:p>
             <w:r>
-              <w:t>LS-DOM-001</w:t>
+              <w:t>DOM-OWN-001</w:t>
             </w:r>
           </w:p>
         </w:tc>
         <w:tc>
           <w:tcPr>
-            <w:tcW w:type="dxa" w:w="2160"/>
+            <w:tcW w:type="dxa" w:w="2448"/>
           </w:tcPr>
           <w:p>
             <w:r>
-              <w:t>Loop Iteration Without Delete</w:t>
+              <w:t>HIGH</w:t>
             </w:r>
           </w:p>
         </w:tc>
         <w:tc>
           <w:tcPr>
-            <w:tcW w:type="dxa" w:w="2160"/>
+            <w:tcW w:type="dxa" w:w="2448"/>
+          </w:tcPr>
+          <w:p>
+            <w:r>
+              <w:t>Unassigned Cross-Function Handle Ownership</w:t>
+            </w:r>
+          </w:p>
+        </w:tc>
+        <w:tc>
+          <w:tcPr>
+            <w:tcW w:type="dxa" w:w="2448"/>
+          </w:tcPr>
+          <w:p>
+            <w:r>
+              <w:t>Static call-graph analysis found a Domino handle returned or accepted across a function boundary without Delete/.recycle() on either the callee or the caller after the call.</w:t>
+            </w:r>
+          </w:p>
+        </w:tc>
+      </w:tr>
+    </w:tbl>
+    <w:p/>
+    <w:p>
+      <w:pPr>
+        <w:pStyle w:val="Heading2"/>
+      </w:pPr>
+      <w:r>
+        <w:t>Framework Conflicts</w:t>
+      </w:r>
+    </w:p>
+    <w:tbl>
+      <w:tblPr>
+        <w:tblStyle w:val="TableGrid"/>
+        <w:tblW w:type="auto" w:w="0"/>
+        <w:tblLook w:firstColumn="1" w:firstRow="1" w:lastColumn="0" w:lastRow="0" w:noHBand="0" w:noVBand="1" w:val="04A0"/>
+      </w:tblPr>
+      <w:tblGrid>
+        <w:gridCol w:w="2448"/>
+        <w:gridCol w:w="2448"/>
+        <w:gridCol w:w="2448"/>
+        <w:gridCol w:w="2448"/>
+      </w:tblGrid>
+      <w:tr>
+        <w:tc>
+          <w:tcPr>
+            <w:tcW w:type="dxa" w:w="2448"/>
+          </w:tcPr>
+          <w:p>
+            <w:r>
+              <w:t>ID</w:t>
+            </w:r>
+          </w:p>
+        </w:tc>
+        <w:tc>
+          <w:tcPr>
+            <w:tcW w:type="dxa" w:w="2448"/>
+          </w:tcPr>
+          <w:p>
+            <w:r>
+              <w:t>Default sev</w:t>
+            </w:r>
+          </w:p>
+        </w:tc>
+        <w:tc>
+          <w:tcPr>
+            <w:tcW w:type="dxa" w:w="2448"/>
+          </w:tcPr>
+          <w:p>
+            <w:r>
+              <w:t>Title</w:t>
+            </w:r>
+          </w:p>
+        </w:tc>
+        <w:tc>
+          <w:tcPr>
+            <w:tcW w:type="dxa" w:w="2448"/>
+          </w:tcPr>
+          <w:p>
+            <w:r>
+              <w:t>What it searches for</w:t>
+            </w:r>
+          </w:p>
+        </w:tc>
+      </w:tr>
+      <w:tr>
+        <w:tc>
+          <w:tcPr>
+            <w:tcW w:type="dxa" w:w="2448"/>
+          </w:tcPr>
+          <w:p>
+            <w:r>
+              <w:t>DOM-004</w:t>
+            </w:r>
+          </w:p>
+        </w:tc>
+        <w:tc>
+          <w:tcPr>
+            <w:tcW w:type="dxa" w:w="2448"/>
           </w:tcPr>
           <w:p>
             <w:r>
@@ -828,11 +977,21 @@
         </w:tc>
         <w:tc>
           <w:tcPr>
-            <w:tcW w:type="dxa" w:w="2160"/>
+            <w:tcW w:type="dxa" w:w="2448"/>
           </w:tcPr>
           <w:p>
             <w:r>
-              <w:t>LotusScript view/collection iteration without Delete of the walked document.</w:t>
+              <w:t>Manual recycle() on OpenNTF Domino API Objects</w:t>
+            </w:r>
+          </w:p>
+        </w:tc>
+        <w:tc>
+          <w:tcPr>
+            <w:tcW w:type="dxa" w:w="2448"/>
+          </w:tcPr>
+          <w:p>
+            <w:r>
+              <w:t>Code using the OpenNTF Domino API still calls `.recycle()` manually. ODA owns the lifecycle — manual recycle can destroy shared handles and stall threads.</w:t>
             </w:r>
           </w:p>
         </w:tc>
@@ -840,27 +999,17 @@
       <w:tr>
         <w:tc>
           <w:tcPr>
-            <w:tcW w:type="dxa" w:w="2160"/>
+            <w:tcW w:type="dxa" w:w="2448"/>
           </w:tcPr>
           <w:p>
             <w:r>
-              <w:t>LS-DOM-002</w:t>
+              <w:t>DOM-005</w:t>
             </w:r>
           </w:p>
         </w:tc>
         <w:tc>
           <w:tcPr>
-            <w:tcW w:type="dxa" w:w="2160"/>
-          </w:tcPr>
-          <w:p>
-            <w:r>
-              <w:t>In-Loop Lookup Document Leaks</w:t>
-            </w:r>
-          </w:p>
-        </w:tc>
-        <w:tc>
-          <w:tcPr>
-            <w:tcW w:type="dxa" w:w="2160"/>
+            <w:tcW w:type="dxa" w:w="2448"/>
           </w:tcPr>
           <w:p>
             <w:r>
@@ -870,11 +1019,85 @@
         </w:tc>
         <w:tc>
           <w:tcPr>
-            <w:tcW w:type="dxa" w:w="2160"/>
+            <w:tcW w:type="dxa" w:w="2448"/>
           </w:tcPr>
           <w:p>
             <w:r>
-              <w:t>In-loop GetDocumentByUNID / GetDocumentByKey without Delete.</w:t>
+              <w:t>Mixed lotus.domino / ODA Object Passing</w:t>
+            </w:r>
+          </w:p>
+        </w:tc>
+        <w:tc>
+          <w:tcPr>
+            <w:tcW w:type="dxa" w:w="2448"/>
+          </w:tcPr>
+          <w:p>
+            <w:r>
+              <w:t>Raw `lotus.domino` objects are mixed with ODA APIs without `Factory.fromLotus()`, so lifecycle tracking is inconsistent.</w:t>
+            </w:r>
+          </w:p>
+        </w:tc>
+      </w:tr>
+    </w:tbl>
+    <w:p/>
+    <w:p>
+      <w:pPr>
+        <w:pStyle w:val="Heading2"/>
+      </w:pPr>
+      <w:r>
+        <w:t>Static Variables &amp; Lifetime Anti-Patterns</w:t>
+      </w:r>
+    </w:p>
+    <w:tbl>
+      <w:tblPr>
+        <w:tblStyle w:val="TableGrid"/>
+        <w:tblW w:type="auto" w:w="0"/>
+        <w:tblLook w:firstColumn="1" w:firstRow="1" w:lastColumn="0" w:lastRow="0" w:noHBand="0" w:noVBand="1" w:val="04A0"/>
+      </w:tblPr>
+      <w:tblGrid>
+        <w:gridCol w:w="2448"/>
+        <w:gridCol w:w="2448"/>
+        <w:gridCol w:w="2448"/>
+        <w:gridCol w:w="2448"/>
+      </w:tblGrid>
+      <w:tr>
+        <w:tc>
+          <w:tcPr>
+            <w:tcW w:type="dxa" w:w="2448"/>
+          </w:tcPr>
+          <w:p>
+            <w:r>
+              <w:t>ID</w:t>
+            </w:r>
+          </w:p>
+        </w:tc>
+        <w:tc>
+          <w:tcPr>
+            <w:tcW w:type="dxa" w:w="2448"/>
+          </w:tcPr>
+          <w:p>
+            <w:r>
+              <w:t>Default sev</w:t>
+            </w:r>
+          </w:p>
+        </w:tc>
+        <w:tc>
+          <w:tcPr>
+            <w:tcW w:type="dxa" w:w="2448"/>
+          </w:tcPr>
+          <w:p>
+            <w:r>
+              <w:t>Title</w:t>
+            </w:r>
+          </w:p>
+        </w:tc>
+        <w:tc>
+          <w:tcPr>
+            <w:tcW w:type="dxa" w:w="2448"/>
+          </w:tcPr>
+          <w:p>
+            <w:r>
+              <w:t>What it searches for</w:t>
             </w:r>
           </w:p>
         </w:tc>
@@ -882,27 +1105,17 @@
       <w:tr>
         <w:tc>
           <w:tcPr>
-            <w:tcW w:type="dxa" w:w="2160"/>
+            <w:tcW w:type="dxa" w:w="2448"/>
           </w:tcPr>
           <w:p>
             <w:r>
-              <w:t>LS-DOM-003</w:t>
+              <w:t>DOM-006</w:t>
             </w:r>
           </w:p>
         </w:tc>
         <w:tc>
           <w:tcPr>
-            <w:tcW w:type="dxa" w:w="2160"/>
-          </w:tcPr>
-          <w:p>
-            <w:r>
-              <w:t>Module / Global Public Notes Object Declarations</w:t>
-            </w:r>
-          </w:p>
-        </w:tc>
-        <w:tc>
-          <w:tcPr>
-            <w:tcW w:type="dxa" w:w="2160"/>
+            <w:tcW w:type="dxa" w:w="2448"/>
           </w:tcPr>
           <w:p>
             <w:r>
@@ -912,11 +1125,21 @@
         </w:tc>
         <w:tc>
           <w:tcPr>
-            <w:tcW w:type="dxa" w:w="2160"/>
+            <w:tcW w:type="dxa" w:w="2448"/>
           </w:tcPr>
           <w:p>
             <w:r>
-              <w:t>Module/global Public Notes* object declarations.</w:t>
+              <w:t>Static Domino Handle Field</w:t>
+            </w:r>
+          </w:p>
+        </w:tc>
+        <w:tc>
+          <w:tcPr>
+            <w:tcW w:type="dxa" w:w="2448"/>
+          </w:tcPr>
+          <w:p>
+            <w:r>
+              <w:t>A Session/Database/Document/View handle is stored in a static or Public module field, keeping native memory alive across requests and risking use-after-recycle.</w:t>
             </w:r>
           </w:p>
         </w:tc>
@@ -924,27 +1147,123 @@
       <w:tr>
         <w:tc>
           <w:tcPr>
-            <w:tcW w:type="dxa" w:w="2160"/>
+            <w:tcW w:type="dxa" w:w="2448"/>
           </w:tcPr>
           <w:p>
             <w:r>
-              <w:t>LS-DOM-004</w:t>
+              <w:t>DOM-007</w:t>
             </w:r>
           </w:p>
         </w:tc>
         <w:tc>
           <w:tcPr>
-            <w:tcW w:type="dxa" w:w="2160"/>
+            <w:tcW w:type="dxa" w:w="2448"/>
           </w:tcPr>
           <w:p>
             <w:r>
-              <w:t>Set Nothing Without Delete</w:t>
+              <w:t>HIGH</w:t>
             </w:r>
           </w:p>
         </w:tc>
         <w:tc>
           <w:tcPr>
-            <w:tcW w:type="dxa" w:w="2160"/>
+            <w:tcW w:type="dxa" w:w="2448"/>
+          </w:tcPr>
+          <w:p>
+            <w:r>
+              <w:t>Unsafe Scope / Static Cache of Native Handles</w:t>
+            </w:r>
+          </w:p>
+        </w:tc>
+        <w:tc>
+          <w:tcPr>
+            <w:tcW w:type="dxa" w:w="2448"/>
+          </w:tcPr>
+          <w:p>
+            <w:r>
+              <w:t>Live Domino handles are cached in session/application scope or static maps instead of serializable identifiers (UNIDs, strings).</w:t>
+            </w:r>
+          </w:p>
+        </w:tc>
+      </w:tr>
+    </w:tbl>
+    <w:p/>
+    <w:p>
+      <w:pPr>
+        <w:pStyle w:val="Heading2"/>
+      </w:pPr>
+      <w:r>
+        <w:t>High-Memory &amp; Expensive Data Patterns</w:t>
+      </w:r>
+    </w:p>
+    <w:tbl>
+      <w:tblPr>
+        <w:tblStyle w:val="TableGrid"/>
+        <w:tblW w:type="auto" w:w="0"/>
+        <w:tblLook w:firstColumn="1" w:firstRow="1" w:lastColumn="0" w:lastRow="0" w:noHBand="0" w:noVBand="1" w:val="04A0"/>
+      </w:tblPr>
+      <w:tblGrid>
+        <w:gridCol w:w="2448"/>
+        <w:gridCol w:w="2448"/>
+        <w:gridCol w:w="2448"/>
+        <w:gridCol w:w="2448"/>
+      </w:tblGrid>
+      <w:tr>
+        <w:tc>
+          <w:tcPr>
+            <w:tcW w:type="dxa" w:w="2448"/>
+          </w:tcPr>
+          <w:p>
+            <w:r>
+              <w:t>ID</w:t>
+            </w:r>
+          </w:p>
+        </w:tc>
+        <w:tc>
+          <w:tcPr>
+            <w:tcW w:type="dxa" w:w="2448"/>
+          </w:tcPr>
+          <w:p>
+            <w:r>
+              <w:t>Default sev</w:t>
+            </w:r>
+          </w:p>
+        </w:tc>
+        <w:tc>
+          <w:tcPr>
+            <w:tcW w:type="dxa" w:w="2448"/>
+          </w:tcPr>
+          <w:p>
+            <w:r>
+              <w:t>Title</w:t>
+            </w:r>
+          </w:p>
+        </w:tc>
+        <w:tc>
+          <w:tcPr>
+            <w:tcW w:type="dxa" w:w="2448"/>
+          </w:tcPr>
+          <w:p>
+            <w:r>
+              <w:t>What it searches for</w:t>
+            </w:r>
+          </w:p>
+        </w:tc>
+      </w:tr>
+      <w:tr>
+        <w:tc>
+          <w:tcPr>
+            <w:tcW w:type="dxa" w:w="2448"/>
+          </w:tcPr>
+          <w:p>
+            <w:r>
+              <w:t>DOM-008</w:t>
+            </w:r>
+          </w:p>
+        </w:tc>
+        <w:tc>
+          <w:tcPr>
+            <w:tcW w:type="dxa" w:w="2448"/>
           </w:tcPr>
           <w:p>
             <w:r>
@@ -954,11 +1273,21 @@
         </w:tc>
         <w:tc>
           <w:tcPr>
-            <w:tcW w:type="dxa" w:w="2160"/>
+            <w:tcW w:type="dxa" w:w="2448"/>
           </w:tcPr>
           <w:p>
             <w:r>
-              <w:t>Set var = Nothing without prior Delete (does not free C-API handle).</w:t>
+              <w:t>Expensive Column/Document Fetch Inside Loop</w:t>
+            </w:r>
+          </w:p>
+        </w:tc>
+        <w:tc>
+          <w:tcPr>
+            <w:tcW w:type="dxa" w:w="2448"/>
+          </w:tcPr>
+          <w:p>
+            <w:r>
+              <w:t>The loop repeatedly materializes full documents or column values, allocating extra handles and CPU on every iteration.</w:t>
             </w:r>
           </w:p>
         </w:tc>
@@ -966,167 +1295,41 @@
       <w:tr>
         <w:tc>
           <w:tcPr>
-            <w:tcW w:type="dxa" w:w="2160"/>
+            <w:tcW w:type="dxa" w:w="2448"/>
           </w:tcPr>
           <w:p>
             <w:r>
-              <w:t>LS-DOM-005</w:t>
+              <w:t>DOM-009</w:t>
             </w:r>
           </w:p>
         </w:tc>
         <w:tc>
           <w:tcPr>
-            <w:tcW w:type="dxa" w:w="2160"/>
+            <w:tcW w:type="dxa" w:w="2448"/>
           </w:tcPr>
           <w:p>
             <w:r>
-              <w:t>Un-Recycled Item &amp; MIME Handles</w:t>
+              <w:t>MEDIUM</w:t>
             </w:r>
           </w:p>
         </w:tc>
         <w:tc>
           <w:tcPr>
-            <w:tcW w:type="dxa" w:w="2160"/>
+            <w:tcW w:type="dxa" w:w="2448"/>
           </w:tcPr>
           <w:p>
             <w:r>
-              <w:t>HIGH</w:t>
+              <w:t>Inline createDateTime Chaining in Loop/Hot Path</w:t>
             </w:r>
           </w:p>
         </w:tc>
         <w:tc>
           <w:tcPr>
-            <w:tcW w:type="dxa" w:w="2160"/>
+            <w:tcW w:type="dxa" w:w="2448"/>
           </w:tcPr>
           <w:p>
             <w:r>
-              <w:t>GetFirstItem / GetMIMEEntity / CreateRichTextItem without Delete.</w:t>
-            </w:r>
-          </w:p>
-        </w:tc>
-      </w:tr>
-      <w:tr>
-        <w:tc>
-          <w:tcPr>
-            <w:tcW w:type="dxa" w:w="2160"/>
-          </w:tcPr>
-          <w:p>
-            <w:r>
-              <w:t>LS-DOM-006</w:t>
-            </w:r>
-          </w:p>
-        </w:tc>
-        <w:tc>
-          <w:tcPr>
-            <w:tcW w:type="dxa" w:w="2160"/>
-          </w:tcPr>
-          <w:p>
-            <w:r>
-              <w:t>Un-Recycled ViewNavigator / ViewEntryCollection</w:t>
-            </w:r>
-          </w:p>
-        </w:tc>
-        <w:tc>
-          <w:tcPr>
-            <w:tcW w:type="dxa" w:w="2160"/>
-          </w:tcPr>
-          <w:p>
-            <w:r>
-              <w:t>CRITICAL</w:t>
-            </w:r>
-          </w:p>
-        </w:tc>
-        <w:tc>
-          <w:tcPr>
-            <w:tcW w:type="dxa" w:w="2160"/>
-          </w:tcPr>
-          <w:p>
-            <w:r>
-              <w:t>NotesViewNavigator / NotesViewEntryCollection without Delete.</w:t>
-            </w:r>
-          </w:p>
-        </w:tc>
-      </w:tr>
-      <w:tr>
-        <w:tc>
-          <w:tcPr>
-            <w:tcW w:type="dxa" w:w="2160"/>
-          </w:tcPr>
-          <w:p>
-            <w:r>
-              <w:t>LS-DOM-007</w:t>
-            </w:r>
-          </w:p>
-        </w:tc>
-        <w:tc>
-          <w:tcPr>
-            <w:tcW w:type="dxa" w:w="2160"/>
-          </w:tcPr>
-          <w:p>
-            <w:r>
-              <w:t>Bypass Cleanup in Error Handler</w:t>
-            </w:r>
-          </w:p>
-        </w:tc>
-        <w:tc>
-          <w:tcPr>
-            <w:tcW w:type="dxa" w:w="2160"/>
-          </w:tcPr>
-          <w:p>
-            <w:r>
-              <w:t>HIGH</w:t>
-            </w:r>
-          </w:p>
-        </w:tc>
-        <w:tc>
-          <w:tcPr>
-            <w:tcW w:type="dxa" w:w="2160"/>
-          </w:tcPr>
-          <w:p>
-            <w:r>
-              <w:t>On Error GoTo handler exits without Delete of NotesDocument/NotesDatabase allocated before the error.</w:t>
-            </w:r>
-          </w:p>
-        </w:tc>
-      </w:tr>
-      <w:tr>
-        <w:tc>
-          <w:tcPr>
-            <w:tcW w:type="dxa" w:w="2160"/>
-          </w:tcPr>
-          <w:p>
-            <w:r>
-              <w:t>LS-DOM-008</w:t>
-            </w:r>
-          </w:p>
-        </w:tc>
-        <w:tc>
-          <w:tcPr>
-            <w:tcW w:type="dxa" w:w="2160"/>
-          </w:tcPr>
-          <w:p>
-            <w:r>
-              <w:t>In-Loop Search Collection Leaks</w:t>
-            </w:r>
-          </w:p>
-        </w:tc>
-        <w:tc>
-          <w:tcPr>
-            <w:tcW w:type="dxa" w:w="2160"/>
-          </w:tcPr>
-          <w:p>
-            <w:r>
-              <w:t>HIGH</w:t>
-            </w:r>
-          </w:p>
-        </w:tc>
-        <w:tc>
-          <w:tcPr>
-            <w:tcW w:type="dxa" w:w="2160"/>
-          </w:tcPr>
-          <w:p>
-            <w:r>
-              <w:t>db.Search / db.FTSearch inside For/While/Do loops without destroying the collection.</w:t>
+              <w:t>`createDateTime` runs inside a hot loop, allocating a native DateTime handle per iteration when a JVM/JS date would suffice.</w:t>
             </w:r>
           </w:p>
         </w:tc>
@@ -1148,25 +1351,35 @@
         <w:tblLook w:firstColumn="1" w:firstRow="1" w:lastColumn="0" w:lastRow="0" w:noHBand="0" w:noVBand="1" w:val="04A0"/>
       </w:tblPr>
       <w:tblGrid>
-        <w:gridCol w:w="2160"/>
-        <w:gridCol w:w="2160"/>
-        <w:gridCol w:w="2160"/>
-        <w:gridCol w:w="2160"/>
+        <w:gridCol w:w="2448"/>
+        <w:gridCol w:w="2448"/>
+        <w:gridCol w:w="2448"/>
+        <w:gridCol w:w="2448"/>
       </w:tblGrid>
       <w:tr>
         <w:tc>
           <w:tcPr>
-            <w:tcW w:type="dxa" w:w="2160"/>
+            <w:tcW w:type="dxa" w:w="2448"/>
           </w:tcPr>
           <w:p>
             <w:r>
-              <w:t>Rule ID</w:t>
+              <w:t>ID</w:t>
             </w:r>
           </w:p>
         </w:tc>
         <w:tc>
           <w:tcPr>
-            <w:tcW w:type="dxa" w:w="2160"/>
+            <w:tcW w:type="dxa" w:w="2448"/>
+          </w:tcPr>
+          <w:p>
+            <w:r>
+              <w:t>Default sev</w:t>
+            </w:r>
+          </w:p>
+        </w:tc>
+        <w:tc>
+          <w:tcPr>
+            <w:tcW w:type="dxa" w:w="2448"/>
           </w:tcPr>
           <w:p>
             <w:r>
@@ -1176,21 +1389,11 @@
         </w:tc>
         <w:tc>
           <w:tcPr>
-            <w:tcW w:type="dxa" w:w="2160"/>
+            <w:tcW w:type="dxa" w:w="2448"/>
           </w:tcPr>
           <w:p>
             <w:r>
-              <w:t>Default severity</w:t>
-            </w:r>
-          </w:p>
-        </w:tc>
-        <w:tc>
-          <w:tcPr>
-            <w:tcW w:type="dxa" w:w="2160"/>
-          </w:tcPr>
-          <w:p>
-            <w:r>
-              <w:t>Detection summary</w:t>
+              <w:t>What it searches for</w:t>
             </w:r>
           </w:p>
         </w:tc>
@@ -1198,7 +1401,7 @@
       <w:tr>
         <w:tc>
           <w:tcPr>
-            <w:tcW w:type="dxa" w:w="2160"/>
+            <w:tcW w:type="dxa" w:w="2448"/>
           </w:tcPr>
           <w:p>
             <w:r>
@@ -1208,7 +1411,17 @@
         </w:tc>
         <w:tc>
           <w:tcPr>
-            <w:tcW w:type="dxa" w:w="2160"/>
+            <w:tcW w:type="dxa" w:w="2448"/>
+          </w:tcPr>
+          <w:p>
+            <w:r>
+              <w:t>HIGH</w:t>
+            </w:r>
+          </w:p>
+        </w:tc>
+        <w:tc>
+          <w:tcPr>
+            <w:tcW w:type="dxa" w:w="2448"/>
           </w:tcPr>
           <w:p>
             <w:r>
@@ -1218,7 +1431,113 @@
         </w:tc>
         <w:tc>
           <w:tcPr>
-            <w:tcW w:type="dxa" w:w="2160"/>
+            <w:tcW w:type="dxa" w:w="2448"/>
+          </w:tcPr>
+          <w:p>
+            <w:r>
+              <w:t>A view write/iteration loop runs without view.AutoUpdate = False, forcing NIF rebuilds on every document change.</w:t>
+            </w:r>
+          </w:p>
+        </w:tc>
+      </w:tr>
+      <w:tr>
+        <w:tc>
+          <w:tcPr>
+            <w:tcW w:type="dxa" w:w="2448"/>
+          </w:tcPr>
+          <w:p>
+            <w:r>
+              <w:t>PERF-002</w:t>
+            </w:r>
+          </w:p>
+        </w:tc>
+        <w:tc>
+          <w:tcPr>
+            <w:tcW w:type="dxa" w:w="2448"/>
+          </w:tcPr>
+          <w:p>
+            <w:r>
+              <w:t>MEDIUM</w:t>
+            </w:r>
+          </w:p>
+        </w:tc>
+        <w:tc>
+          <w:tcPr>
+            <w:tcW w:type="dxa" w:w="2448"/>
+          </w:tcPr>
+          <w:p>
+            <w:r>
+              <w:t>Hoistable db.getView() Inside Loop</w:t>
+            </w:r>
+          </w:p>
+        </w:tc>
+        <w:tc>
+          <w:tcPr>
+            <w:tcW w:type="dxa" w:w="2448"/>
+          </w:tcPr>
+          <w:p>
+            <w:r>
+              <w:t>db.getView / GetView is called inside a loop instead of hoisting the view handle outside.</w:t>
+            </w:r>
+          </w:p>
+        </w:tc>
+      </w:tr>
+      <w:tr>
+        <w:tc>
+          <w:tcPr>
+            <w:tcW w:type="dxa" w:w="2448"/>
+          </w:tcPr>
+          <w:p>
+            <w:r>
+              <w:t>PERF-003</w:t>
+            </w:r>
+          </w:p>
+        </w:tc>
+        <w:tc>
+          <w:tcPr>
+            <w:tcW w:type="dxa" w:w="2448"/>
+          </w:tcPr>
+          <w:p>
+            <w:r>
+              <w:t>MEDIUM</w:t>
+            </w:r>
+          </w:p>
+        </w:tc>
+        <w:tc>
+          <w:tcPr>
+            <w:tcW w:type="dxa" w:w="2448"/>
+          </w:tcPr>
+          <w:p>
+            <w:r>
+              <w:t>Un-batched Document Save in Large Iteration</w:t>
+            </w:r>
+          </w:p>
+        </w:tc>
+        <w:tc>
+          <w:tcPr>
+            <w:tcW w:type="dxa" w:w="2448"/>
+          </w:tcPr>
+          <w:p>
+            <w:r>
+              <w:t>doc.save / doc.Save runs on every collection iteration without batching — high I/O and log bloat.</w:t>
+            </w:r>
+          </w:p>
+        </w:tc>
+      </w:tr>
+      <w:tr>
+        <w:tc>
+          <w:tcPr>
+            <w:tcW w:type="dxa" w:w="2448"/>
+          </w:tcPr>
+          <w:p>
+            <w:r>
+              <w:t>PERF-004</w:t>
+            </w:r>
+          </w:p>
+        </w:tc>
+        <w:tc>
+          <w:tcPr>
+            <w:tcW w:type="dxa" w:w="2448"/>
           </w:tcPr>
           <w:p>
             <w:r>
@@ -1228,95 +1547,21 @@
         </w:tc>
         <w:tc>
           <w:tcPr>
-            <w:tcW w:type="dxa" w:w="2160"/>
+            <w:tcW w:type="dxa" w:w="2448"/>
           </w:tcPr>
           <w:p>
             <w:r>
-              <w:t>Iterating/modifying via NotesView without view.AutoUpdate = False — NIF rebuild on every write.</w:t>
-            </w:r>
-          </w:p>
-        </w:tc>
-      </w:tr>
-      <w:tr>
-        <w:tc>
-          <w:tcPr>
-            <w:tcW w:type="dxa" w:w="2160"/>
-          </w:tcPr>
-          <w:p>
-            <w:r>
-              <w:t>PERF-002</w:t>
+              <w:t>O(n²) GetNthDocument/GetNthEntry Iteration</w:t>
             </w:r>
           </w:p>
         </w:tc>
         <w:tc>
           <w:tcPr>
-            <w:tcW w:type="dxa" w:w="2160"/>
+            <w:tcW w:type="dxa" w:w="2448"/>
           </w:tcPr>
           <w:p>
             <w:r>
-              <w:t>Hoistable db.getView() Inside Loop</w:t>
-            </w:r>
-          </w:p>
-        </w:tc>
-        <w:tc>
-          <w:tcPr>
-            <w:tcW w:type="dxa" w:w="2160"/>
-          </w:tcPr>
-          <w:p>
-            <w:r>
-              <w:t>MEDIUM</w:t>
-            </w:r>
-          </w:p>
-        </w:tc>
-        <w:tc>
-          <w:tcPr>
-            <w:tcW w:type="dxa" w:w="2160"/>
-          </w:tcPr>
-          <w:p>
-            <w:r>
-              <w:t>db.getView / db.GetView repeatedly inside a loop instead of hoisting the view handle.</w:t>
-            </w:r>
-          </w:p>
-        </w:tc>
-      </w:tr>
-      <w:tr>
-        <w:tc>
-          <w:tcPr>
-            <w:tcW w:type="dxa" w:w="2160"/>
-          </w:tcPr>
-          <w:p>
-            <w:r>
-              <w:t>PERF-003</w:t>
-            </w:r>
-          </w:p>
-        </w:tc>
-        <w:tc>
-          <w:tcPr>
-            <w:tcW w:type="dxa" w:w="2160"/>
-          </w:tcPr>
-          <w:p>
-            <w:r>
-              <w:t>Un-batched Document Save in Large Iteration</w:t>
-            </w:r>
-          </w:p>
-        </w:tc>
-        <w:tc>
-          <w:tcPr>
-            <w:tcW w:type="dxa" w:w="2160"/>
-          </w:tcPr>
-          <w:p>
-            <w:r>
-              <w:t>MEDIUM</w:t>
-            </w:r>
-          </w:p>
-        </w:tc>
-        <w:tc>
-          <w:tcPr>
-            <w:tcW w:type="dxa" w:w="2160"/>
-          </w:tcPr>
-          <w:p>
-            <w:r>
-              <w:t>doc.save / doc.Save on every collection iteration without batching/throttling.</w:t>
+              <w:t>GetNthDocument / GetNthEntry inside a counted loop re-walks the collection from the start on every call — O(n²) that can hang agents or exceed HTTP task timeouts.</w:t>
             </w:r>
           </w:p>
         </w:tc>
@@ -1328,7 +1573,7 @@
         <w:pStyle w:val="Heading2"/>
       </w:pPr>
       <w:r>
-        <w:t>Framework Conflicts</w:t>
+        <w:t>Application Security</w:t>
       </w:r>
     </w:p>
     <w:tbl>
@@ -1338,25 +1583,35 @@
         <w:tblLook w:firstColumn="1" w:firstRow="1" w:lastColumn="0" w:lastRow="0" w:noHBand="0" w:noVBand="1" w:val="04A0"/>
       </w:tblPr>
       <w:tblGrid>
-        <w:gridCol w:w="2160"/>
-        <w:gridCol w:w="2160"/>
-        <w:gridCol w:w="2160"/>
-        <w:gridCol w:w="2160"/>
+        <w:gridCol w:w="2448"/>
+        <w:gridCol w:w="2448"/>
+        <w:gridCol w:w="2448"/>
+        <w:gridCol w:w="2448"/>
       </w:tblGrid>
       <w:tr>
         <w:tc>
           <w:tcPr>
-            <w:tcW w:type="dxa" w:w="2160"/>
+            <w:tcW w:type="dxa" w:w="2448"/>
           </w:tcPr>
           <w:p>
             <w:r>
-              <w:t>Rule ID</w:t>
+              <w:t>ID</w:t>
             </w:r>
           </w:p>
         </w:tc>
         <w:tc>
           <w:tcPr>
-            <w:tcW w:type="dxa" w:w="2160"/>
+            <w:tcW w:type="dxa" w:w="2448"/>
+          </w:tcPr>
+          <w:p>
+            <w:r>
+              <w:t>Default sev</w:t>
+            </w:r>
+          </w:p>
+        </w:tc>
+        <w:tc>
+          <w:tcPr>
+            <w:tcW w:type="dxa" w:w="2448"/>
           </w:tcPr>
           <w:p>
             <w:r>
@@ -1366,21 +1621,11 @@
         </w:tc>
         <w:tc>
           <w:tcPr>
-            <w:tcW w:type="dxa" w:w="2160"/>
+            <w:tcW w:type="dxa" w:w="2448"/>
           </w:tcPr>
           <w:p>
             <w:r>
-              <w:t>Default severity</w:t>
-            </w:r>
-          </w:p>
-        </w:tc>
-        <w:tc>
-          <w:tcPr>
-            <w:tcW w:type="dxa" w:w="2160"/>
-          </w:tcPr>
-          <w:p>
-            <w:r>
-              <w:t>Detection summary</w:t>
+              <w:t>What it searches for</w:t>
             </w:r>
           </w:p>
         </w:tc>
@@ -1388,69 +1633,17 @@
       <w:tr>
         <w:tc>
           <w:tcPr>
-            <w:tcW w:type="dxa" w:w="2160"/>
+            <w:tcW w:type="dxa" w:w="2448"/>
           </w:tcPr>
           <w:p>
             <w:r>
-              <w:t>DOM-004</w:t>
+              <w:t>SEC-001</w:t>
             </w:r>
           </w:p>
         </w:tc>
         <w:tc>
           <w:tcPr>
-            <w:tcW w:type="dxa" w:w="2160"/>
-          </w:tcPr>
-          <w:p>
-            <w:r>
-              <w:t>Manual recycle() on OpenNTF Domino API Objects</w:t>
-            </w:r>
-          </w:p>
-        </w:tc>
-        <w:tc>
-          <w:tcPr>
-            <w:tcW w:type="dxa" w:w="2160"/>
-          </w:tcPr>
-          <w:p>
-            <w:r>
-              <w:t>CRITICAL</w:t>
-            </w:r>
-          </w:p>
-        </w:tc>
-        <w:tc>
-          <w:tcPr>
-            <w:tcW w:type="dxa" w:w="2160"/>
-          </w:tcPr>
-          <w:p>
-            <w:r>
-              <w:t>Manual recycle() on OpenNTF Domino API (ODA) objects that manage their own lifecycle.</w:t>
-            </w:r>
-          </w:p>
-        </w:tc>
-      </w:tr>
-      <w:tr>
-        <w:tc>
-          <w:tcPr>
-            <w:tcW w:type="dxa" w:w="2160"/>
-          </w:tcPr>
-          <w:p>
-            <w:r>
-              <w:t>DOM-005</w:t>
-            </w:r>
-          </w:p>
-        </w:tc>
-        <w:tc>
-          <w:tcPr>
-            <w:tcW w:type="dxa" w:w="2160"/>
-          </w:tcPr>
-          <w:p>
-            <w:r>
-              <w:t>Mixed lotus.domino / ODA Object Passing</w:t>
-            </w:r>
-          </w:p>
-        </w:tc>
-        <w:tc>
-          <w:tcPr>
-            <w:tcW w:type="dxa" w:w="2160"/>
+            <w:tcW w:type="dxa" w:w="2448"/>
           </w:tcPr>
           <w:p>
             <w:r>
@@ -1460,11 +1653,63 @@
         </w:tc>
         <w:tc>
           <w:tcPr>
-            <w:tcW w:type="dxa" w:w="2160"/>
+            <w:tcW w:type="dxa" w:w="2448"/>
           </w:tcPr>
           <w:p>
             <w:r>
-              <w:t>Mixing lotus.domino and ODA objects across API boundaries.</w:t>
+              <w:t>Hardcoded Credentials / Plaintext HTTP</w:t>
+            </w:r>
+          </w:p>
+        </w:tc>
+        <w:tc>
+          <w:tcPr>
+            <w:tcW w:type="dxa" w:w="2448"/>
+          </w:tcPr>
+          <w:p>
+            <w:r>
+              <w:t>A password or secret is hardcoded in source and used with an http:// endpoint, exposing credentials in cleartext.</w:t>
+            </w:r>
+          </w:p>
+        </w:tc>
+      </w:tr>
+      <w:tr>
+        <w:tc>
+          <w:tcPr>
+            <w:tcW w:type="dxa" w:w="2448"/>
+          </w:tcPr>
+          <w:p>
+            <w:r>
+              <w:t>SEC-002</w:t>
+            </w:r>
+          </w:p>
+        </w:tc>
+        <w:tc>
+          <w:tcPr>
+            <w:tcW w:type="dxa" w:w="2448"/>
+          </w:tcPr>
+          <w:p>
+            <w:r>
+              <w:t>HIGH</w:t>
+            </w:r>
+          </w:p>
+        </w:tc>
+        <w:tc>
+          <w:tcPr>
+            <w:tcW w:type="dxa" w:w="2448"/>
+          </w:tcPr>
+          <w:p>
+            <w:r>
+              <w:t>Unvalidated Query String Document Lookup</w:t>
+            </w:r>
+          </w:p>
+        </w:tc>
+        <w:tc>
+          <w:tcPr>
+            <w:tcW w:type="dxa" w:w="2448"/>
+          </w:tcPr>
+          <w:p>
+            <w:r>
+              <w:t>GetDocumentByUNID is driven by URL/query input without an evident authorization check, allowing UNID enumeration / unauthorized document access.</w:t>
             </w:r>
           </w:p>
         </w:tc>
@@ -1476,7 +1721,7 @@
         <w:pStyle w:val="Heading2"/>
       </w:pPr>
       <w:r>
-        <w:t>Static Variables &amp; Lifetime Anti-Patterns</w:t>
+        <w:t>Formula Quality</w:t>
       </w:r>
     </w:p>
     <w:tbl>
@@ -1486,25 +1731,35 @@
         <w:tblLook w:firstColumn="1" w:firstRow="1" w:lastColumn="0" w:lastRow="0" w:noHBand="0" w:noVBand="1" w:val="04A0"/>
       </w:tblPr>
       <w:tblGrid>
-        <w:gridCol w:w="2160"/>
-        <w:gridCol w:w="2160"/>
-        <w:gridCol w:w="2160"/>
-        <w:gridCol w:w="2160"/>
+        <w:gridCol w:w="2448"/>
+        <w:gridCol w:w="2448"/>
+        <w:gridCol w:w="2448"/>
+        <w:gridCol w:w="2448"/>
       </w:tblGrid>
       <w:tr>
         <w:tc>
           <w:tcPr>
-            <w:tcW w:type="dxa" w:w="2160"/>
+            <w:tcW w:type="dxa" w:w="2448"/>
           </w:tcPr>
           <w:p>
             <w:r>
-              <w:t>Rule ID</w:t>
+              <w:t>ID</w:t>
             </w:r>
           </w:p>
         </w:tc>
         <w:tc>
           <w:tcPr>
-            <w:tcW w:type="dxa" w:w="2160"/>
+            <w:tcW w:type="dxa" w:w="2448"/>
+          </w:tcPr>
+          <w:p>
+            <w:r>
+              <w:t>Default sev</w:t>
+            </w:r>
+          </w:p>
+        </w:tc>
+        <w:tc>
+          <w:tcPr>
+            <w:tcW w:type="dxa" w:w="2448"/>
           </w:tcPr>
           <w:p>
             <w:r>
@@ -1514,21 +1769,11 @@
         </w:tc>
         <w:tc>
           <w:tcPr>
-            <w:tcW w:type="dxa" w:w="2160"/>
+            <w:tcW w:type="dxa" w:w="2448"/>
           </w:tcPr>
           <w:p>
             <w:r>
-              <w:t>Default severity</w:t>
-            </w:r>
-          </w:p>
-        </w:tc>
-        <w:tc>
-          <w:tcPr>
-            <w:tcW w:type="dxa" w:w="2160"/>
-          </w:tcPr>
-          <w:p>
-            <w:r>
-              <w:t>Detection summary</w:t>
+              <w:t>What it searches for</w:t>
             </w:r>
           </w:p>
         </w:tc>
@@ -1536,41 +1781,41 @@
       <w:tr>
         <w:tc>
           <w:tcPr>
-            <w:tcW w:type="dxa" w:w="2160"/>
+            <w:tcW w:type="dxa" w:w="2448"/>
           </w:tcPr>
           <w:p>
             <w:r>
-              <w:t>DOM-006</w:t>
+              <w:t>FORM-001</w:t>
             </w:r>
           </w:p>
         </w:tc>
         <w:tc>
           <w:tcPr>
-            <w:tcW w:type="dxa" w:w="2160"/>
+            <w:tcW w:type="dxa" w:w="2448"/>
           </w:tcPr>
           <w:p>
             <w:r>
-              <w:t>Static Domino Handle Field</w:t>
+              <w:t>MEDIUM</w:t>
             </w:r>
           </w:p>
         </w:tc>
         <w:tc>
           <w:tcPr>
-            <w:tcW w:type="dxa" w:w="2160"/>
+            <w:tcW w:type="dxa" w:w="2448"/>
           </w:tcPr>
           <w:p>
             <w:r>
-              <w:t>CRITICAL</w:t>
+              <w:t>Repeated @DbLookup/@DbColumn in Formula</w:t>
             </w:r>
           </w:p>
         </w:tc>
         <w:tc>
           <w:tcPr>
-            <w:tcW w:type="dxa" w:w="2160"/>
+            <w:tcW w:type="dxa" w:w="2448"/>
           </w:tcPr>
           <w:p>
             <w:r>
-              <w:t>Static field holding a Domino native handle across requests/threads.</w:t>
+              <w:t>Formula repeats @DbLookup/@DbColumn. Each call hits NSF/NIF and can dominate computed-field cost.</w:t>
             </w:r>
           </w:p>
         </w:tc>
@@ -1578,27 +1823,17 @@
       <w:tr>
         <w:tc>
           <w:tcPr>
-            <w:tcW w:type="dxa" w:w="2160"/>
+            <w:tcW w:type="dxa" w:w="2448"/>
           </w:tcPr>
           <w:p>
             <w:r>
-              <w:t>DOM-007</w:t>
+              <w:t>FORM-002</w:t>
             </w:r>
           </w:p>
         </w:tc>
         <w:tc>
           <w:tcPr>
-            <w:tcW w:type="dxa" w:w="2160"/>
-          </w:tcPr>
-          <w:p>
-            <w:r>
-              <w:t>Unsafe Scope / Static Cache of Native Handles</w:t>
-            </w:r>
-          </w:p>
-        </w:tc>
-        <w:tc>
-          <w:tcPr>
-            <w:tcW w:type="dxa" w:w="2160"/>
+            <w:tcW w:type="dxa" w:w="2448"/>
           </w:tcPr>
           <w:p>
             <w:r>
@@ -1608,75 +1843,21 @@
         </w:tc>
         <w:tc>
           <w:tcPr>
-            <w:tcW w:type="dxa" w:w="2160"/>
+            <w:tcW w:type="dxa" w:w="2448"/>
           </w:tcPr>
           <w:p>
             <w:r>
-              <w:t>Unsafe scope or static cache of native handles.</w:t>
-            </w:r>
-          </w:p>
-        </w:tc>
-      </w:tr>
-    </w:tbl>
-    <w:p/>
-    <w:p>
-      <w:pPr>
-        <w:pStyle w:val="Heading2"/>
-      </w:pPr>
-      <w:r>
-        <w:t>High-Memory &amp; Expensive Data Patterns</w:t>
-      </w:r>
-    </w:p>
-    <w:tbl>
-      <w:tblPr>
-        <w:tblStyle w:val="TableGrid"/>
-        <w:tblW w:type="auto" w:w="0"/>
-        <w:tblLook w:firstColumn="1" w:firstRow="1" w:lastColumn="0" w:lastRow="0" w:noHBand="0" w:noVBand="1" w:val="04A0"/>
-      </w:tblPr>
-      <w:tblGrid>
-        <w:gridCol w:w="2160"/>
-        <w:gridCol w:w="2160"/>
-        <w:gridCol w:w="2160"/>
-        <w:gridCol w:w="2160"/>
-      </w:tblGrid>
-      <w:tr>
-        <w:tc>
-          <w:tcPr>
-            <w:tcW w:type="dxa" w:w="2160"/>
-          </w:tcPr>
-          <w:p>
-            <w:r>
-              <w:t>Rule ID</w:t>
+              <w:t>In-Loop @DbLookup/@DbColumn in Formula</w:t>
             </w:r>
           </w:p>
         </w:tc>
         <w:tc>
           <w:tcPr>
-            <w:tcW w:type="dxa" w:w="2160"/>
+            <w:tcW w:type="dxa" w:w="2448"/>
           </w:tcPr>
           <w:p>
             <w:r>
-              <w:t>Title</w:t>
-            </w:r>
-          </w:p>
-        </w:tc>
-        <w:tc>
-          <w:tcPr>
-            <w:tcW w:type="dxa" w:w="2160"/>
-          </w:tcPr>
-          <w:p>
-            <w:r>
-              <w:t>Default severity</w:t>
-            </w:r>
-          </w:p>
-        </w:tc>
-        <w:tc>
-          <w:tcPr>
-            <w:tcW w:type="dxa" w:w="2160"/>
-          </w:tcPr>
-          <w:p>
-            <w:r>
-              <w:t>Detection summary</w:t>
+              <w:t>Formula loops (@While/@For) while calling @DbLookup/@DbColumn — lookup cost scales with iterations.</w:t>
             </w:r>
           </w:p>
         </w:tc>
@@ -1684,83 +1865,41 @@
       <w:tr>
         <w:tc>
           <w:tcPr>
-            <w:tcW w:type="dxa" w:w="2160"/>
+            <w:tcW w:type="dxa" w:w="2448"/>
           </w:tcPr>
           <w:p>
             <w:r>
-              <w:t>DOM-008</w:t>
+              <w:t>FORM-003</w:t>
             </w:r>
           </w:p>
         </w:tc>
         <w:tc>
           <w:tcPr>
-            <w:tcW w:type="dxa" w:w="2160"/>
+            <w:tcW w:type="dxa" w:w="2448"/>
           </w:tcPr>
           <w:p>
             <w:r>
-              <w:t>Expensive Column/Document Fetch Inside Loop</w:t>
+              <w:t>HIGH</w:t>
             </w:r>
           </w:p>
         </w:tc>
         <w:tc>
           <w:tcPr>
-            <w:tcW w:type="dxa" w:w="2160"/>
+            <w:tcW w:type="dxa" w:w="2448"/>
           </w:tcPr>
           <w:p>
             <w:r>
-              <w:t>MEDIUM</w:t>
+              <w:t>Hardcoded Secret or Plaintext HTTP in Formula</w:t>
             </w:r>
           </w:p>
         </w:tc>
         <w:tc>
           <w:tcPr>
-            <w:tcW w:type="dxa" w:w="2160"/>
+            <w:tcW w:type="dxa" w:w="2448"/>
           </w:tcPr>
           <w:p>
             <w:r>
-              <w:t>Expensive column/document fetch inside a hot loop.</w:t>
-            </w:r>
-          </w:p>
-        </w:tc>
-      </w:tr>
-      <w:tr>
-        <w:tc>
-          <w:tcPr>
-            <w:tcW w:type="dxa" w:w="2160"/>
-          </w:tcPr>
-          <w:p>
-            <w:r>
-              <w:t>DOM-009</w:t>
-            </w:r>
-          </w:p>
-        </w:tc>
-        <w:tc>
-          <w:tcPr>
-            <w:tcW w:type="dxa" w:w="2160"/>
-          </w:tcPr>
-          <w:p>
-            <w:r>
-              <w:t>Inline createDateTime Chaining in Loop/Hot Path</w:t>
-            </w:r>
-          </w:p>
-        </w:tc>
-        <w:tc>
-          <w:tcPr>
-            <w:tcW w:type="dxa" w:w="2160"/>
-          </w:tcPr>
-          <w:p>
-            <w:r>
-              <w:t>MEDIUM</w:t>
-            </w:r>
-          </w:p>
-        </w:tc>
-        <w:tc>
-          <w:tcPr>
-            <w:tcW w:type="dxa" w:w="2160"/>
-          </w:tcPr>
-          <w:p>
-            <w:r>
-              <w:t>Inline createDateTime chaining on a hot path/loop.</w:t>
+              <w:t>Formula embeds a credential-like literal or plaintext http:// endpoint.</w:t>
             </w:r>
           </w:p>
         </w:tc>
@@ -1782,25 +1921,35 @@
         <w:tblLook w:firstColumn="1" w:firstRow="1" w:lastColumn="0" w:lastRow="0" w:noHBand="0" w:noVBand="1" w:val="04A0"/>
       </w:tblPr>
       <w:tblGrid>
-        <w:gridCol w:w="2160"/>
-        <w:gridCol w:w="2160"/>
-        <w:gridCol w:w="2160"/>
-        <w:gridCol w:w="2160"/>
+        <w:gridCol w:w="2448"/>
+        <w:gridCol w:w="2448"/>
+        <w:gridCol w:w="2448"/>
+        <w:gridCol w:w="2448"/>
       </w:tblGrid>
       <w:tr>
         <w:tc>
           <w:tcPr>
-            <w:tcW w:type="dxa" w:w="2160"/>
+            <w:tcW w:type="dxa" w:w="2448"/>
           </w:tcPr>
           <w:p>
             <w:r>
-              <w:t>Rule ID</w:t>
+              <w:t>ID</w:t>
             </w:r>
           </w:p>
         </w:tc>
         <w:tc>
           <w:tcPr>
-            <w:tcW w:type="dxa" w:w="2160"/>
+            <w:tcW w:type="dxa" w:w="2448"/>
+          </w:tcPr>
+          <w:p>
+            <w:r>
+              <w:t>Default sev</w:t>
+            </w:r>
+          </w:p>
+        </w:tc>
+        <w:tc>
+          <w:tcPr>
+            <w:tcW w:type="dxa" w:w="2448"/>
           </w:tcPr>
           <w:p>
             <w:r>
@@ -1810,21 +1959,11 @@
         </w:tc>
         <w:tc>
           <w:tcPr>
-            <w:tcW w:type="dxa" w:w="2160"/>
+            <w:tcW w:type="dxa" w:w="2448"/>
           </w:tcPr>
           <w:p>
             <w:r>
-              <w:t>Default severity</w:t>
-            </w:r>
-          </w:p>
-        </w:tc>
-        <w:tc>
-          <w:tcPr>
-            <w:tcW w:type="dxa" w:w="2160"/>
-          </w:tcPr>
-          <w:p>
-            <w:r>
-              <w:t>Detection summary</w:t>
+              <w:t>What it searches for</w:t>
             </w:r>
           </w:p>
         </w:tc>
@@ -1832,7 +1971,7 @@
       <w:tr>
         <w:tc>
           <w:tcPr>
-            <w:tcW w:type="dxa" w:w="2160"/>
+            <w:tcW w:type="dxa" w:w="2448"/>
           </w:tcPr>
           <w:p>
             <w:r>
@@ -1842,7 +1981,17 @@
         </w:tc>
         <w:tc>
           <w:tcPr>
-            <w:tcW w:type="dxa" w:w="2160"/>
+            <w:tcW w:type="dxa" w:w="2448"/>
+          </w:tcPr>
+          <w:p>
+            <w:r>
+              <w:t>HIGH</w:t>
+            </w:r>
+          </w:p>
+        </w:tc>
+        <w:tc>
+          <w:tcPr>
+            <w:tcW w:type="dxa" w:w="2448"/>
           </w:tcPr>
           <w:p>
             <w:r>
@@ -1852,7 +2001,29 @@
         </w:tc>
         <w:tc>
           <w:tcPr>
-            <w:tcW w:type="dxa" w:w="2160"/>
+            <w:tcW w:type="dxa" w:w="2448"/>
+          </w:tcPr>
+          <w:p>
+            <w:r>
+              <w:t>AI control-flow analysis found a Domino handle allocation path that static regex rules missed — typically nested branches, exception paths, or non-standard cleanup gaps.</w:t>
+            </w:r>
+          </w:p>
+        </w:tc>
+      </w:tr>
+      <w:tr>
+        <w:tc>
+          <w:tcPr>
+            <w:tcW w:type="dxa" w:w="2448"/>
+          </w:tcPr>
+          <w:p>
+            <w:r>
+              <w:t>DOM-BS-002</w:t>
+            </w:r>
+          </w:p>
+        </w:tc>
+        <w:tc>
+          <w:tcPr>
+            <w:tcW w:type="dxa" w:w="2448"/>
           </w:tcPr>
           <w:p>
             <w:r>
@@ -1862,29 +2033,7 @@
         </w:tc>
         <w:tc>
           <w:tcPr>
-            <w:tcW w:type="dxa" w:w="2160"/>
-          </w:tcPr>
-          <w:p>
-            <w:r>
-              <w:t>AI Pass 2 blind-spot: handle leak missed by static regex rules.</w:t>
-            </w:r>
-          </w:p>
-        </w:tc>
-      </w:tr>
-      <w:tr>
-        <w:tc>
-          <w:tcPr>
-            <w:tcW w:type="dxa" w:w="2160"/>
-          </w:tcPr>
-          <w:p>
-            <w:r>
-              <w:t>DOM-BS-002</w:t>
-            </w:r>
-          </w:p>
-        </w:tc>
-        <w:tc>
-          <w:tcPr>
-            <w:tcW w:type="dxa" w:w="2160"/>
+            <w:tcW w:type="dxa" w:w="2448"/>
           </w:tcPr>
           <w:p>
             <w:r>
@@ -1894,7 +2043,140 @@
         </w:tc>
         <w:tc>
           <w:tcPr>
-            <w:tcW w:type="dxa" w:w="2160"/>
+            <w:tcW w:type="dxa" w:w="2448"/>
+          </w:tcPr>
+          <w:p>
+            <w:r>
+              <w:t>AI cross-module analysis found a Document/NotesDocument passed or returned across functions where neither caller nor callee clearly owns recycle/Delete.</w:t>
+            </w:r>
+          </w:p>
+        </w:tc>
+      </w:tr>
+    </w:tbl>
+    <w:p/>
+    <w:p>
+      <w:pPr>
+        <w:pStyle w:val="Heading2"/>
+      </w:pPr>
+      <w:r>
+        <w:t>LotusScript Handle Lifecycle</w:t>
+      </w:r>
+    </w:p>
+    <w:p>
+      <w:r>
+        <w:t>Reference only — not applied to Handle Exhaustion inventory or UI work list.</w:t>
+      </w:r>
+    </w:p>
+    <w:tbl>
+      <w:tblPr>
+        <w:tblStyle w:val="TableGrid"/>
+        <w:tblW w:type="auto" w:w="0"/>
+        <w:tblLook w:firstColumn="1" w:firstRow="1" w:lastColumn="0" w:lastRow="0" w:noHBand="0" w:noVBand="1" w:val="04A0"/>
+      </w:tblPr>
+      <w:tblGrid>
+        <w:gridCol w:w="2448"/>
+        <w:gridCol w:w="2448"/>
+        <w:gridCol w:w="2448"/>
+        <w:gridCol w:w="2448"/>
+      </w:tblGrid>
+      <w:tr>
+        <w:tc>
+          <w:tcPr>
+            <w:tcW w:type="dxa" w:w="2448"/>
+          </w:tcPr>
+          <w:p>
+            <w:r>
+              <w:t>ID</w:t>
+            </w:r>
+          </w:p>
+        </w:tc>
+        <w:tc>
+          <w:tcPr>
+            <w:tcW w:type="dxa" w:w="2448"/>
+          </w:tcPr>
+          <w:p>
+            <w:r>
+              <w:t>Default sev</w:t>
+            </w:r>
+          </w:p>
+        </w:tc>
+        <w:tc>
+          <w:tcPr>
+            <w:tcW w:type="dxa" w:w="2448"/>
+          </w:tcPr>
+          <w:p>
+            <w:r>
+              <w:t>Title</w:t>
+            </w:r>
+          </w:p>
+        </w:tc>
+        <w:tc>
+          <w:tcPr>
+            <w:tcW w:type="dxa" w:w="2448"/>
+          </w:tcPr>
+          <w:p>
+            <w:r>
+              <w:t>What it searches for</w:t>
+            </w:r>
+          </w:p>
+        </w:tc>
+      </w:tr>
+      <w:tr>
+        <w:tc>
+          <w:tcPr>
+            <w:tcW w:type="dxa" w:w="2448"/>
+          </w:tcPr>
+          <w:p>
+            <w:r>
+              <w:t>LS-DOM-001</w:t>
+            </w:r>
+          </w:p>
+        </w:tc>
+        <w:tc>
+          <w:tcPr>
+            <w:tcW w:type="dxa" w:w="2448"/>
+          </w:tcPr>
+          <w:p>
+            <w:r>
+              <w:t>CRITICAL</w:t>
+            </w:r>
+          </w:p>
+        </w:tc>
+        <w:tc>
+          <w:tcPr>
+            <w:tcW w:type="dxa" w:w="2448"/>
+          </w:tcPr>
+          <w:p>
+            <w:r>
+              <w:t>Loop Iteration Without Delete</w:t>
+            </w:r>
+          </w:p>
+        </w:tc>
+        <w:tc>
+          <w:tcPr>
+            <w:tcW w:type="dxa" w:w="2448"/>
+          </w:tcPr>
+          <w:p>
+            <w:r>
+              <w:t>A LotusScript `Do While` / `Do Until` / `Forall` / `While` loop advances documents or view entries with `GetNextDocument` / `GetNextEntry` but never `Delete`s the previous handle. Each iteration leaves a native C-API object pinned until the Sub exits.</w:t>
+            </w:r>
+          </w:p>
+        </w:tc>
+      </w:tr>
+      <w:tr>
+        <w:tc>
+          <w:tcPr>
+            <w:tcW w:type="dxa" w:w="2448"/>
+          </w:tcPr>
+          <w:p>
+            <w:r>
+              <w:t>LS-DOM-002</w:t>
+            </w:r>
+          </w:p>
+        </w:tc>
+        <w:tc>
+          <w:tcPr>
+            <w:tcW w:type="dxa" w:w="2448"/>
           </w:tcPr>
           <w:p>
             <w:r>
@@ -1904,11 +2186,273 @@
         </w:tc>
         <w:tc>
           <w:tcPr>
-            <w:tcW w:type="dxa" w:w="2160"/>
+            <w:tcW w:type="dxa" w:w="2448"/>
           </w:tcPr>
           <w:p>
             <w:r>
-              <w:t>AI Pass 3: Document/NotesDocument crosses function boundary with neither caller nor callee releasing it.</w:t>
+              <w:t>In-Loop Lookup Document Leaks</w:t>
+            </w:r>
+          </w:p>
+        </w:tc>
+        <w:tc>
+          <w:tcPr>
+            <w:tcW w:type="dxa" w:w="2448"/>
+          </w:tcPr>
+          <w:p>
+            <w:r>
+              <w:t>Inside a loop, a secondary `GetDocumentByUNID` / `GetDocumentByKey` / `CreateDocument` assigns a NotesDocument that is never `Delete`d before the next iteration, leaking one handle per pass.</w:t>
+            </w:r>
+          </w:p>
+        </w:tc>
+      </w:tr>
+      <w:tr>
+        <w:tc>
+          <w:tcPr>
+            <w:tcW w:type="dxa" w:w="2448"/>
+          </w:tcPr>
+          <w:p>
+            <w:r>
+              <w:t>LS-DOM-003</w:t>
+            </w:r>
+          </w:p>
+        </w:tc>
+        <w:tc>
+          <w:tcPr>
+            <w:tcW w:type="dxa" w:w="2448"/>
+          </w:tcPr>
+          <w:p>
+            <w:r>
+              <w:t>CRITICAL</w:t>
+            </w:r>
+          </w:p>
+        </w:tc>
+        <w:tc>
+          <w:tcPr>
+            <w:tcW w:type="dxa" w:w="2448"/>
+          </w:tcPr>
+          <w:p>
+            <w:r>
+              <w:t>Module / Global Public Notes Object Declarations</w:t>
+            </w:r>
+          </w:p>
+        </w:tc>
+        <w:tc>
+          <w:tcPr>
+            <w:tcW w:type="dxa" w:w="2448"/>
+          </w:tcPr>
+          <w:p>
+            <w:r>
+              <w:t>`Public … As NotesDocument|NotesDatabase|NotesView` in (Declarations) pins native handles in server RAM across agent and library executions.</w:t>
+            </w:r>
+          </w:p>
+        </w:tc>
+      </w:tr>
+      <w:tr>
+        <w:tc>
+          <w:tcPr>
+            <w:tcW w:type="dxa" w:w="2448"/>
+          </w:tcPr>
+          <w:p>
+            <w:r>
+              <w:t>LS-DOM-004</w:t>
+            </w:r>
+          </w:p>
+        </w:tc>
+        <w:tc>
+          <w:tcPr>
+            <w:tcW w:type="dxa" w:w="2448"/>
+          </w:tcPr>
+          <w:p>
+            <w:r>
+              <w:t>MEDIUM</w:t>
+            </w:r>
+          </w:p>
+        </w:tc>
+        <w:tc>
+          <w:tcPr>
+            <w:tcW w:type="dxa" w:w="2448"/>
+          </w:tcPr>
+          <w:p>
+            <w:r>
+              <w:t>Set Nothing Without Delete</w:t>
+            </w:r>
+          </w:p>
+        </w:tc>
+        <w:tc>
+          <w:tcPr>
+            <w:tcW w:type="dxa" w:w="2448"/>
+          </w:tcPr>
+          <w:p>
+            <w:r>
+              <w:t>`Set doc = Nothing` clears the LotusScript pointer variable but does not explicitly release the C-API handle the way `Delete doc` does; native memory may linger until the calling routine terminates.</w:t>
+            </w:r>
+          </w:p>
+        </w:tc>
+      </w:tr>
+      <w:tr>
+        <w:tc>
+          <w:tcPr>
+            <w:tcW w:type="dxa" w:w="2448"/>
+          </w:tcPr>
+          <w:p>
+            <w:r>
+              <w:t>LS-DOM-005</w:t>
+            </w:r>
+          </w:p>
+        </w:tc>
+        <w:tc>
+          <w:tcPr>
+            <w:tcW w:type="dxa" w:w="2448"/>
+          </w:tcPr>
+          <w:p>
+            <w:r>
+              <w:t>HIGH</w:t>
+            </w:r>
+          </w:p>
+        </w:tc>
+        <w:tc>
+          <w:tcPr>
+            <w:tcW w:type="dxa" w:w="2448"/>
+          </w:tcPr>
+          <w:p>
+            <w:r>
+              <w:t>Un-Recycled Item &amp; MIME Handles</w:t>
+            </w:r>
+          </w:p>
+        </w:tc>
+        <w:tc>
+          <w:tcPr>
+            <w:tcW w:type="dxa" w:w="2448"/>
+          </w:tcPr>
+          <w:p>
+            <w:r>
+              <w:t>LotusScript GetFirstItem / GetMIMEEntity / CreateRichTextItem assigns a handle without Delete.</w:t>
+            </w:r>
+          </w:p>
+        </w:tc>
+      </w:tr>
+      <w:tr>
+        <w:tc>
+          <w:tcPr>
+            <w:tcW w:type="dxa" w:w="2448"/>
+          </w:tcPr>
+          <w:p>
+            <w:r>
+              <w:t>LS-DOM-006</w:t>
+            </w:r>
+          </w:p>
+        </w:tc>
+        <w:tc>
+          <w:tcPr>
+            <w:tcW w:type="dxa" w:w="2448"/>
+          </w:tcPr>
+          <w:p>
+            <w:r>
+              <w:t>CRITICAL</w:t>
+            </w:r>
+          </w:p>
+        </w:tc>
+        <w:tc>
+          <w:tcPr>
+            <w:tcW w:type="dxa" w:w="2448"/>
+          </w:tcPr>
+          <w:p>
+            <w:r>
+              <w:t>Un-Recycled ViewNavigator / ViewEntryCollection</w:t>
+            </w:r>
+          </w:p>
+        </w:tc>
+        <w:tc>
+          <w:tcPr>
+            <w:tcW w:type="dxa" w:w="2448"/>
+          </w:tcPr>
+          <w:p>
+            <w:r>
+              <w:t>NotesViewNavigator / NotesViewEntryCollection created without Delete — index locks persist.</w:t>
+            </w:r>
+          </w:p>
+        </w:tc>
+      </w:tr>
+      <w:tr>
+        <w:tc>
+          <w:tcPr>
+            <w:tcW w:type="dxa" w:w="2448"/>
+          </w:tcPr>
+          <w:p>
+            <w:r>
+              <w:t>LS-DOM-007</w:t>
+            </w:r>
+          </w:p>
+        </w:tc>
+        <w:tc>
+          <w:tcPr>
+            <w:tcW w:type="dxa" w:w="2448"/>
+          </w:tcPr>
+          <w:p>
+            <w:r>
+              <w:t>HIGH</w:t>
+            </w:r>
+          </w:p>
+        </w:tc>
+        <w:tc>
+          <w:tcPr>
+            <w:tcW w:type="dxa" w:w="2448"/>
+          </w:tcPr>
+          <w:p>
+            <w:r>
+              <w:t>Bypass Cleanup in Error Handler</w:t>
+            </w:r>
+          </w:p>
+        </w:tc>
+        <w:tc>
+          <w:tcPr>
+            <w:tcW w:type="dxa" w:w="2448"/>
+          </w:tcPr>
+          <w:p>
+            <w:r>
+              <w:t>On Error GoTo handler exits without Delete of Notes* temps allocated on the main path.</w:t>
+            </w:r>
+          </w:p>
+        </w:tc>
+      </w:tr>
+      <w:tr>
+        <w:tc>
+          <w:tcPr>
+            <w:tcW w:type="dxa" w:w="2448"/>
+          </w:tcPr>
+          <w:p>
+            <w:r>
+              <w:t>LS-DOM-008</w:t>
+            </w:r>
+          </w:p>
+        </w:tc>
+        <w:tc>
+          <w:tcPr>
+            <w:tcW w:type="dxa" w:w="2448"/>
+          </w:tcPr>
+          <w:p>
+            <w:r>
+              <w:t>HIGH</w:t>
+            </w:r>
+          </w:p>
+        </w:tc>
+        <w:tc>
+          <w:tcPr>
+            <w:tcW w:type="dxa" w:w="2448"/>
+          </w:tcPr>
+          <w:p>
+            <w:r>
+              <w:t>In-Loop Search Collection Leaks</w:t>
+            </w:r>
+          </w:p>
+        </w:tc>
+        <w:tc>
+          <w:tcPr>
+            <w:tcW w:type="dxa" w:w="2448"/>
+          </w:tcPr>
+          <w:p>
+            <w:r>
+              <w:t>Search / FTSearch inside a LotusScript loop without Delete of the returned collection.</w:t>
             </w:r>
           </w:p>
         </w:tc>
@@ -1917,10 +2461,25 @@
     <w:p/>
     <w:p>
       <w:pPr>
-        <w:pStyle w:val="Heading1"/>
+        <w:pStyle w:val="Heading2"/>
       </w:pPr>
       <w:r>
-        <w:t>5. AI discrepancy &amp; inference (--llm)</w:t>
+        <w:t>Remediation philosophy</w:t>
+      </w:r>
+    </w:p>
+    <w:p>
+      <w:r>
+        <w:t>Java / SSJS / XPages: assign intermediates, advance collections with a next-handle variable, release with .recycle() in finally on every path.</w:t>
+      </w:r>
+    </w:p>
+    <w:p>
+      <w:r>
+        <w:t>LotusScript (hygiene reference): Delete Notes* objects (or Call obj.Recycle) before re-assignment; Set x = Nothing alone is not enough.</w:t>
+      </w:r>
+    </w:p>
+    <w:p>
+      <w:r>
+        <w:t>ODA (org.openntf.domino): do not manually recycle — framework owns lifecycle.</w:t>
       </w:r>
     </w:p>
     <w:p>
@@ -1928,12 +2487,86 @@
         <w:pStyle w:val="Heading2"/>
       </w:pPr>
       <w:r>
-        <w:t>5.1 Pass 1 — False Positive Filter</w:t>
+        <w:t>Example remediation guides (Java)</w:t>
       </w:r>
     </w:p>
     <w:p>
       <w:r>
-        <w:t>Reviews static-rule findings for safe/non-standard cleanup (ODA auto-lifecycle, custom helpers, early Delete, framework wrappers). Marks FALSE_POSITIVE or VERIFIED.</w:t>
+        <w:rPr>
+          <w:b/>
+        </w:rPr>
+        <w:t xml:space="preserve">DOM-001: </w:t>
+      </w:r>
+      <w:r>
+        <w:t>Assign intermediates to variables and call `.recycle()` in a `finally` block.</w:t>
+      </w:r>
+    </w:p>
+    <w:p>
+      <w:r>
+        <w:rPr>
+          <w:b/>
+        </w:rPr>
+        <w:t xml:space="preserve">DOM-002: </w:t>
+      </w:r>
+      <w:r>
+        <w:t>Capture `next` first, process `doc` inside `try`, always `doc.recycle()` in `finally`, then `doc = next`.</w:t>
+      </w:r>
+    </w:p>
+    <w:p>
+      <w:r>
+        <w:rPr>
+          <w:b/>
+        </w:rPr>
+        <w:t xml:space="preserve">DOM-010: </w:t>
+      </w:r>
+      <w:r>
+        <w:t>Use `try`/`finally` and `.recycle()` for every Database/View/Document you open.</w:t>
+      </w:r>
+    </w:p>
+    <w:p>
+      <w:r>
+        <w:rPr>
+          <w:b/>
+        </w:rPr>
+        <w:t xml:space="preserve">DOM-013: </w:t>
+      </w:r>
+      <w:r>
+        <w:t>Use a temp `next`, `doc.recycle()`, then `doc = next`.</w:t>
+      </w:r>
+    </w:p>
+    <w:p>
+      <w:r>
+        <w:rPr>
+          <w:b/>
+        </w:rPr>
+        <w:t xml:space="preserve">PERF-001: </w:t>
+      </w:r>
+      <w:r>
+        <w:t>view.setAutoUpdate(false) before the loop; restore true after.</w:t>
+      </w:r>
+    </w:p>
+    <w:p>
+      <w:r>
+        <w:rPr>
+          <w:b/>
+        </w:rPr>
+        <w:t xml:space="preserve">DOM-OWN-001: </w:t>
+      </w:r>
+      <w:r>
+        <w:t>Clarify ownership: recycle in callee before return, or in caller after use — never neither.</w:t>
+      </w:r>
+    </w:p>
+    <w:p>
+      <w:pPr>
+        <w:pStyle w:val="Heading1"/>
+      </w:pPr>
+      <w:r>
+        <w:t>4. AI inference rules</w:t>
+      </w:r>
+    </w:p>
+    <w:p>
+      <w:r>
+        <w:t>AI runs automatically when analysis is computed and OPENAI_API_KEY is configured. Cached reloads stay fast; Refresh analysis recomputes with AI. Reviews below the confidence threshold (default 75%) are discarded.</w:t>
       </w:r>
     </w:p>
     <w:p>
@@ -1941,12 +2574,41 @@
         <w:pStyle w:val="Heading2"/>
       </w:pPr>
       <w:r>
-        <w:t>5.2 Pass 2 — Blind-Spot Detector (DOM-BS-001)</w:t>
+        <w:t>Pass 1 — False-positive / severity filter</w:t>
       </w:r>
     </w:p>
     <w:p>
       <w:r>
-        <w:t>Inspects handle-allocating units with zero static hits for nested branches, exception paths, and re-assignment leaks missed by regex.</w:t>
+        <w:t>Input: static-rule findings + surrounding code. Verdicts:</w:t>
+      </w:r>
+    </w:p>
+    <w:p>
+      <w:pPr>
+        <w:pStyle w:val="ListBullet"/>
+      </w:pPr>
+      <w:r>
+        <w:t>FALSE_POSITIVE — cleanup is clearly present or framework-owned (ODA, helper Delete, etc.).</w:t>
+      </w:r>
+    </w:p>
+    <w:p>
+      <w:pPr>
+        <w:pStyle w:val="ListBullet"/>
+      </w:pPr>
+      <w:r>
+        <w:t>VERIFIED_NON_LOOP — real issue but one-shot / non-loop → demote to LOW hygiene.</w:t>
+      </w:r>
+    </w:p>
+    <w:p>
+      <w:pPr>
+        <w:pStyle w:val="ListBullet"/>
+      </w:pPr>
+      <w:r>
+        <w:t>VERIFIED — real leak / anti-pattern, especially inside collection loops.</w:t>
+      </w:r>
+    </w:p>
+    <w:p>
+      <w:r>
+        <w:t>Conservative: only mark FALSE_POSITIVE when cleanup is clear. Emits confidence 0–100.</w:t>
       </w:r>
     </w:p>
     <w:p>
@@ -1954,7 +2616,33 @@
         <w:pStyle w:val="Heading2"/>
       </w:pPr>
       <w:r>
-        <w:t>5.3 Pass 3 — Cross-Module Ownership &amp; Risk Escalation (DOM-BS-002)</w:t>
+        <w:t>Pass 2 — Blind-spot detector (DOM-BS-001)</w:t>
+      </w:r>
+    </w:p>
+    <w:p>
+      <w:r>
+        <w:t>Runs on units that allocate Domino handles but had zero static hits. Looks for nested branches, early exits, conditional loops skipping recycle, exception paths, and re-assignment without releasing the prior handle. Empty result if genuinely safe.</w:t>
+      </w:r>
+    </w:p>
+    <w:p>
+      <w:pPr>
+        <w:pStyle w:val="Heading2"/>
+      </w:pPr>
+      <w:r>
+        <w:t>Pass 3 — Cross-module ownership (DOM-BS-002)</w:t>
+      </w:r>
+    </w:p>
+    <w:p>
+      <w:r>
+        <w:t>Caller/callee contracts across related units: who must Delete/.recycle() when a Document is returned or passed. Escalates severity for scheduled/background agents vs one-shot UI events. Skips elements already covered by deterministic DOM-OWN-001.</w:t>
+      </w:r>
+    </w:p>
+    <w:p>
+      <w:pPr>
+        <w:pStyle w:val="Heading2"/>
+      </w:pPr>
+      <w:r>
+        <w:t>What AI does not do</w:t>
       </w:r>
     </w:p>
     <w:p>
@@ -1962,7 +2650,7 @@
         <w:pStyle w:val="ListBullet"/>
       </w:pPr>
       <w:r>
-        <w:t>Cross-boundary ownership: when Document/NotesDocument is returned or accepted as a parameter, assign Delete/.recycle() to caller or callee; if neither releases, emit DOM-BS-002.</w:t>
+        <w:t>Does not rewrite application business logic or invent unique To-Be patches per function.</w:t>
       </w:r>
     </w:p>
     <w:p>
@@ -1970,7 +2658,7 @@
         <w:pStyle w:val="ListBullet"/>
       </w:pPr>
       <w:r>
-        <w:t>To-Be sanity: remediation must preserve return values and business/transaction logic when adding try/finally or Delete.</w:t>
+        <w:t>Does not replace static rules — it validates, demotes, or adds residual gaps.</w:t>
       </w:r>
     </w:p>
     <w:p>
@@ -1978,38 +2666,21 @@
         <w:pStyle w:val="ListBullet"/>
       </w:pPr>
       <w:r>
-        <w:t>Dynamic severity: escalate findings on scheduled background agents / bulk processors vs one-shot form events.</w:t>
+        <w:t>Does not override a human Mark as false positive triage (persisted in Neon).</w:t>
       </w:r>
     </w:p>
-    <w:p>
-      <w:pPr>
-        <w:pStyle w:val="Heading1"/>
-      </w:pPr>
-      <w:r>
-        <w:t>6. Remediation presentation</w:t>
-      </w:r>
-    </w:p>
+    <w:p/>
     <w:p>
       <w:r>
-        <w:t>The Code Analysis deep-dive shows Problem Breakdown, Remediation Guide, As-Is (vulnerable) with hit-line highlight, and To-Be (safe) templates. PERF-* findings additionally surface a Performance impact callout (e.g. PERF-001 AutoUpdate / NIF recalculation).</w:t>
-      </w:r>
-    </w:p>
-    <w:p>
-      <w:pPr>
-        <w:pStyle w:val="Heading1"/>
-      </w:pPr>
-      <w:r>
-        <w:t>7. CLI</w:t>
-      </w:r>
-    </w:p>
-    <w:p>
-      <w:r>
-        <w:t>python3 domino_dxl_auditor.py &lt;dxl|dir| --graph graph.json&gt; [--llm] [--out-dir analysis]</w:t>
+        <w:rPr>
+          <w:i/>
+        </w:rPr>
+        <w:t>Generated by Xer · Download again anytime from Code Analysis to get the current catalog.</w:t>
       </w:r>
     </w:p>
     <w:sectPr>
       <w:pgSz w:w="12240" w:h="15840"/>
-      <w:pgMar w:top="1440" w:right="1800" w:bottom="1440" w:left="1800" w:header="720" w:footer="720" w:gutter="0"/>
+      <w:pgMar w:top="1080" w:right="1224" w:bottom="1080" w:left="1224" w:header="720" w:footer="720" w:gutter="0"/>
       <w:cols w:space="720"/>
       <w:docGrid w:linePitch="360"/>
     </w:sectPr>
@@ -2380,10 +3051,6 @@
     <w:name w:val="Normal"/>
     <w:qFormat/>
     <w:rsid w:val="00FC693F"/>
-    <w:rPr>
-      <w:rFonts w:ascii="Calibri" w:hAnsi="Calibri"/>
-      <w:sz w:val="22"/>
-    </w:rPr>
   </w:style>
   <w:style w:type="paragraph" w:styleId="Header">
     <w:name w:val="header"/>

</xml_diff>

<commit_message>
Omit LotusScript from the rules and rubric export.
Co-authored-by: Cursor <cursoragent@cursor.com>
</commit_message>
<xml_diff>
--- a/docs/Xer_Code_Analysis_Rubric.docx
+++ b/docs/Xer_Code_Analysis_Rubric.docx
@@ -19,12 +19,12 @@
         <w:t xml:space="preserve">Generated: </w:t>
       </w:r>
       <w:r>
-        <w:t>2026-09-09 18:29 UTC</w:t>
+        <w:t>2026-09-09 18:47 UTC</w:t>
       </w:r>
     </w:p>
     <w:p>
       <w:r>
-        <w:t>This document is the live catalog of static search rules, scoring rubric, and AI inference passes used by Xer Code Analysis. It is generated from the product rule catalog (not a frozen copy).</w:t>
+        <w:t>This document is the live catalog of static search rules, scoring rubric, and AI inference passes for Domino C-API handle exhaustion (Java / SSJS / XPages). LotusScript is omitted — it does not share the Java C-API handle-table allocation model.</w:t>
       </w:r>
     </w:p>
     <w:p>
@@ -77,7 +77,7 @@
     </w:p>
     <w:p>
       <w:r>
-        <w:t>Handle Exhaustion scope is Java / SSJS / XPages only. LotusScript LS-DOM-* detectors remain in the catalog for reference but are not wired into Handle Exhaustion scoring.</w:t>
+        <w:t>Out of scope: LotusScript. LS object lifetimes do not create the same native C-API handle-table exhaustion risk as Java/SSJS .recycle() leaks, so LotusScript rules are not part of this rubric or the Handle Exhaustion work list.</w:t>
       </w:r>
     </w:p>
     <w:p>
@@ -2059,422 +2059,12 @@
         <w:pStyle w:val="Heading2"/>
       </w:pPr>
       <w:r>
-        <w:t>LotusScript Handle Lifecycle</w:t>
-      </w:r>
-    </w:p>
-    <w:p>
-      <w:r>
-        <w:t>Reference only — not applied to Handle Exhaustion inventory or UI work list.</w:t>
-      </w:r>
-    </w:p>
-    <w:tbl>
-      <w:tblPr>
-        <w:tblStyle w:val="TableGrid"/>
-        <w:tblW w:type="auto" w:w="0"/>
-        <w:tblLook w:firstColumn="1" w:firstRow="1" w:lastColumn="0" w:lastRow="0" w:noHBand="0" w:noVBand="1" w:val="04A0"/>
-      </w:tblPr>
-      <w:tblGrid>
-        <w:gridCol w:w="2448"/>
-        <w:gridCol w:w="2448"/>
-        <w:gridCol w:w="2448"/>
-        <w:gridCol w:w="2448"/>
-      </w:tblGrid>
-      <w:tr>
-        <w:tc>
-          <w:tcPr>
-            <w:tcW w:type="dxa" w:w="2448"/>
-          </w:tcPr>
-          <w:p>
-            <w:r>
-              <w:t>ID</w:t>
-            </w:r>
-          </w:p>
-        </w:tc>
-        <w:tc>
-          <w:tcPr>
-            <w:tcW w:type="dxa" w:w="2448"/>
-          </w:tcPr>
-          <w:p>
-            <w:r>
-              <w:t>Default sev</w:t>
-            </w:r>
-          </w:p>
-        </w:tc>
-        <w:tc>
-          <w:tcPr>
-            <w:tcW w:type="dxa" w:w="2448"/>
-          </w:tcPr>
-          <w:p>
-            <w:r>
-              <w:t>Title</w:t>
-            </w:r>
-          </w:p>
-        </w:tc>
-        <w:tc>
-          <w:tcPr>
-            <w:tcW w:type="dxa" w:w="2448"/>
-          </w:tcPr>
-          <w:p>
-            <w:r>
-              <w:t>What it searches for</w:t>
-            </w:r>
-          </w:p>
-        </w:tc>
-      </w:tr>
-      <w:tr>
-        <w:tc>
-          <w:tcPr>
-            <w:tcW w:type="dxa" w:w="2448"/>
-          </w:tcPr>
-          <w:p>
-            <w:r>
-              <w:t>LS-DOM-001</w:t>
-            </w:r>
-          </w:p>
-        </w:tc>
-        <w:tc>
-          <w:tcPr>
-            <w:tcW w:type="dxa" w:w="2448"/>
-          </w:tcPr>
-          <w:p>
-            <w:r>
-              <w:t>CRITICAL</w:t>
-            </w:r>
-          </w:p>
-        </w:tc>
-        <w:tc>
-          <w:tcPr>
-            <w:tcW w:type="dxa" w:w="2448"/>
-          </w:tcPr>
-          <w:p>
-            <w:r>
-              <w:t>Loop Iteration Without Delete</w:t>
-            </w:r>
-          </w:p>
-        </w:tc>
-        <w:tc>
-          <w:tcPr>
-            <w:tcW w:type="dxa" w:w="2448"/>
-          </w:tcPr>
-          <w:p>
-            <w:r>
-              <w:t>A LotusScript `Do While` / `Do Until` / `Forall` / `While` loop advances documents or view entries with `GetNextDocument` / `GetNextEntry` but never `Delete`s the previous handle. Each iteration leaves a native C-API object pinned until the Sub exits.</w:t>
-            </w:r>
-          </w:p>
-        </w:tc>
-      </w:tr>
-      <w:tr>
-        <w:tc>
-          <w:tcPr>
-            <w:tcW w:type="dxa" w:w="2448"/>
-          </w:tcPr>
-          <w:p>
-            <w:r>
-              <w:t>LS-DOM-002</w:t>
-            </w:r>
-          </w:p>
-        </w:tc>
-        <w:tc>
-          <w:tcPr>
-            <w:tcW w:type="dxa" w:w="2448"/>
-          </w:tcPr>
-          <w:p>
-            <w:r>
-              <w:t>HIGH</w:t>
-            </w:r>
-          </w:p>
-        </w:tc>
-        <w:tc>
-          <w:tcPr>
-            <w:tcW w:type="dxa" w:w="2448"/>
-          </w:tcPr>
-          <w:p>
-            <w:r>
-              <w:t>In-Loop Lookup Document Leaks</w:t>
-            </w:r>
-          </w:p>
-        </w:tc>
-        <w:tc>
-          <w:tcPr>
-            <w:tcW w:type="dxa" w:w="2448"/>
-          </w:tcPr>
-          <w:p>
-            <w:r>
-              <w:t>Inside a loop, a secondary `GetDocumentByUNID` / `GetDocumentByKey` / `CreateDocument` assigns a NotesDocument that is never `Delete`d before the next iteration, leaking one handle per pass.</w:t>
-            </w:r>
-          </w:p>
-        </w:tc>
-      </w:tr>
-      <w:tr>
-        <w:tc>
-          <w:tcPr>
-            <w:tcW w:type="dxa" w:w="2448"/>
-          </w:tcPr>
-          <w:p>
-            <w:r>
-              <w:t>LS-DOM-003</w:t>
-            </w:r>
-          </w:p>
-        </w:tc>
-        <w:tc>
-          <w:tcPr>
-            <w:tcW w:type="dxa" w:w="2448"/>
-          </w:tcPr>
-          <w:p>
-            <w:r>
-              <w:t>CRITICAL</w:t>
-            </w:r>
-          </w:p>
-        </w:tc>
-        <w:tc>
-          <w:tcPr>
-            <w:tcW w:type="dxa" w:w="2448"/>
-          </w:tcPr>
-          <w:p>
-            <w:r>
-              <w:t>Module / Global Public Notes Object Declarations</w:t>
-            </w:r>
-          </w:p>
-        </w:tc>
-        <w:tc>
-          <w:tcPr>
-            <w:tcW w:type="dxa" w:w="2448"/>
-          </w:tcPr>
-          <w:p>
-            <w:r>
-              <w:t>`Public … As NotesDocument|NotesDatabase|NotesView` in (Declarations) pins native handles in server RAM across agent and library executions.</w:t>
-            </w:r>
-          </w:p>
-        </w:tc>
-      </w:tr>
-      <w:tr>
-        <w:tc>
-          <w:tcPr>
-            <w:tcW w:type="dxa" w:w="2448"/>
-          </w:tcPr>
-          <w:p>
-            <w:r>
-              <w:t>LS-DOM-004</w:t>
-            </w:r>
-          </w:p>
-        </w:tc>
-        <w:tc>
-          <w:tcPr>
-            <w:tcW w:type="dxa" w:w="2448"/>
-          </w:tcPr>
-          <w:p>
-            <w:r>
-              <w:t>MEDIUM</w:t>
-            </w:r>
-          </w:p>
-        </w:tc>
-        <w:tc>
-          <w:tcPr>
-            <w:tcW w:type="dxa" w:w="2448"/>
-          </w:tcPr>
-          <w:p>
-            <w:r>
-              <w:t>Set Nothing Without Delete</w:t>
-            </w:r>
-          </w:p>
-        </w:tc>
-        <w:tc>
-          <w:tcPr>
-            <w:tcW w:type="dxa" w:w="2448"/>
-          </w:tcPr>
-          <w:p>
-            <w:r>
-              <w:t>`Set doc = Nothing` clears the LotusScript pointer variable but does not explicitly release the C-API handle the way `Delete doc` does; native memory may linger until the calling routine terminates.</w:t>
-            </w:r>
-          </w:p>
-        </w:tc>
-      </w:tr>
-      <w:tr>
-        <w:tc>
-          <w:tcPr>
-            <w:tcW w:type="dxa" w:w="2448"/>
-          </w:tcPr>
-          <w:p>
-            <w:r>
-              <w:t>LS-DOM-005</w:t>
-            </w:r>
-          </w:p>
-        </w:tc>
-        <w:tc>
-          <w:tcPr>
-            <w:tcW w:type="dxa" w:w="2448"/>
-          </w:tcPr>
-          <w:p>
-            <w:r>
-              <w:t>HIGH</w:t>
-            </w:r>
-          </w:p>
-        </w:tc>
-        <w:tc>
-          <w:tcPr>
-            <w:tcW w:type="dxa" w:w="2448"/>
-          </w:tcPr>
-          <w:p>
-            <w:r>
-              <w:t>Un-Recycled Item &amp; MIME Handles</w:t>
-            </w:r>
-          </w:p>
-        </w:tc>
-        <w:tc>
-          <w:tcPr>
-            <w:tcW w:type="dxa" w:w="2448"/>
-          </w:tcPr>
-          <w:p>
-            <w:r>
-              <w:t>LotusScript GetFirstItem / GetMIMEEntity / CreateRichTextItem assigns a handle without Delete.</w:t>
-            </w:r>
-          </w:p>
-        </w:tc>
-      </w:tr>
-      <w:tr>
-        <w:tc>
-          <w:tcPr>
-            <w:tcW w:type="dxa" w:w="2448"/>
-          </w:tcPr>
-          <w:p>
-            <w:r>
-              <w:t>LS-DOM-006</w:t>
-            </w:r>
-          </w:p>
-        </w:tc>
-        <w:tc>
-          <w:tcPr>
-            <w:tcW w:type="dxa" w:w="2448"/>
-          </w:tcPr>
-          <w:p>
-            <w:r>
-              <w:t>CRITICAL</w:t>
-            </w:r>
-          </w:p>
-        </w:tc>
-        <w:tc>
-          <w:tcPr>
-            <w:tcW w:type="dxa" w:w="2448"/>
-          </w:tcPr>
-          <w:p>
-            <w:r>
-              <w:t>Un-Recycled ViewNavigator / ViewEntryCollection</w:t>
-            </w:r>
-          </w:p>
-        </w:tc>
-        <w:tc>
-          <w:tcPr>
-            <w:tcW w:type="dxa" w:w="2448"/>
-          </w:tcPr>
-          <w:p>
-            <w:r>
-              <w:t>NotesViewNavigator / NotesViewEntryCollection created without Delete — index locks persist.</w:t>
-            </w:r>
-          </w:p>
-        </w:tc>
-      </w:tr>
-      <w:tr>
-        <w:tc>
-          <w:tcPr>
-            <w:tcW w:type="dxa" w:w="2448"/>
-          </w:tcPr>
-          <w:p>
-            <w:r>
-              <w:t>LS-DOM-007</w:t>
-            </w:r>
-          </w:p>
-        </w:tc>
-        <w:tc>
-          <w:tcPr>
-            <w:tcW w:type="dxa" w:w="2448"/>
-          </w:tcPr>
-          <w:p>
-            <w:r>
-              <w:t>HIGH</w:t>
-            </w:r>
-          </w:p>
-        </w:tc>
-        <w:tc>
-          <w:tcPr>
-            <w:tcW w:type="dxa" w:w="2448"/>
-          </w:tcPr>
-          <w:p>
-            <w:r>
-              <w:t>Bypass Cleanup in Error Handler</w:t>
-            </w:r>
-          </w:p>
-        </w:tc>
-        <w:tc>
-          <w:tcPr>
-            <w:tcW w:type="dxa" w:w="2448"/>
-          </w:tcPr>
-          <w:p>
-            <w:r>
-              <w:t>On Error GoTo handler exits without Delete of Notes* temps allocated on the main path.</w:t>
-            </w:r>
-          </w:p>
-        </w:tc>
-      </w:tr>
-      <w:tr>
-        <w:tc>
-          <w:tcPr>
-            <w:tcW w:type="dxa" w:w="2448"/>
-          </w:tcPr>
-          <w:p>
-            <w:r>
-              <w:t>LS-DOM-008</w:t>
-            </w:r>
-          </w:p>
-        </w:tc>
-        <w:tc>
-          <w:tcPr>
-            <w:tcW w:type="dxa" w:w="2448"/>
-          </w:tcPr>
-          <w:p>
-            <w:r>
-              <w:t>HIGH</w:t>
-            </w:r>
-          </w:p>
-        </w:tc>
-        <w:tc>
-          <w:tcPr>
-            <w:tcW w:type="dxa" w:w="2448"/>
-          </w:tcPr>
-          <w:p>
-            <w:r>
-              <w:t>In-Loop Search Collection Leaks</w:t>
-            </w:r>
-          </w:p>
-        </w:tc>
-        <w:tc>
-          <w:tcPr>
-            <w:tcW w:type="dxa" w:w="2448"/>
-          </w:tcPr>
-          <w:p>
-            <w:r>
-              <w:t>Search / FTSearch inside a LotusScript loop without Delete of the returned collection.</w:t>
-            </w:r>
-          </w:p>
-        </w:tc>
-      </w:tr>
-    </w:tbl>
-    <w:p/>
-    <w:p>
-      <w:pPr>
-        <w:pStyle w:val="Heading2"/>
-      </w:pPr>
-      <w:r>
         <w:t>Remediation philosophy</w:t>
       </w:r>
     </w:p>
     <w:p>
       <w:r>
         <w:t>Java / SSJS / XPages: assign intermediates, advance collections with a next-handle variable, release with .recycle() in finally on every path.</w:t>
-      </w:r>
-    </w:p>
-    <w:p>
-      <w:r>
-        <w:t>LotusScript (hygiene reference): Delete Notes* objects (or Call obj.Recycle) before re-assignment; Set x = Nothing alone is not enough.</w:t>
       </w:r>
     </w:p>
     <w:p>
@@ -2587,7 +2177,7 @@
         <w:pStyle w:val="ListBullet"/>
       </w:pPr>
       <w:r>
-        <w:t>FALSE_POSITIVE — cleanup is clearly present or framework-owned (ODA, helper Delete, etc.).</w:t>
+        <w:t>FALSE_POSITIVE — cleanup is clearly present or framework-owned (ODA, helper recycle, etc.).</w:t>
       </w:r>
     </w:p>
     <w:p>
@@ -2634,7 +2224,7 @@
     </w:p>
     <w:p>
       <w:r>
-        <w:t>Caller/callee contracts across related units: who must Delete/.recycle() when a Document is returned or passed. Escalates severity for scheduled/background agents vs one-shot UI events. Skips elements already covered by deterministic DOM-OWN-001.</w:t>
+        <w:t>Caller/callee contracts across related Java / SSJS units: who must .recycle() when a Document is returned or passed. Escalates severity for scheduled/background agents vs one-shot UI events. Skips elements already covered by deterministic DOM-OWN-001.</w:t>
       </w:r>
     </w:p>
     <w:p>

</xml_diff>

<commit_message>
Show fuller As-Is context around findings and scrub LotusScript wording from the rubric.
Expand snippet windows to include try/finally/recycle so handle-leak findings are not ambiguous, and remove remaining LotusScript language references from the rules guide.

Co-authored-by: Cursor <cursoragent@cursor.com>
</commit_message>
<xml_diff>
--- a/docs/Xer_Code_Analysis_Rubric.docx
+++ b/docs/Xer_Code_Analysis_Rubric.docx
@@ -19,12 +19,12 @@
         <w:t xml:space="preserve">Generated: </w:t>
       </w:r>
       <w:r>
-        <w:t>2026-09-09 18:47 UTC</w:t>
+        <w:t>2026-09-09 18:51 UTC</w:t>
       </w:r>
     </w:p>
     <w:p>
       <w:r>
-        <w:t>This document is the live catalog of static search rules, scoring rubric, and AI inference passes for Domino C-API handle exhaustion (Java / SSJS / XPages). LotusScript is omitted — it does not share the Java C-API handle-table allocation model.</w:t>
+        <w:t>This document is the live catalog of static search rules, scoring rubric, and AI inference passes for Domino C-API handle exhaustion on Java / SSJS / XPages. It is generated from the product rule catalog (not a frozen copy).</w:t>
       </w:r>
     </w:p>
     <w:p>
@@ -73,11 +73,6 @@
       </w:pPr>
       <w:r>
         <w:t>Apply confidence gate (default XER_AI_CONFIDENCE_MIN=75) and human triage overrides.</w:t>
-      </w:r>
-    </w:p>
-    <w:p>
-      <w:r>
-        <w:t>Out of scope: LotusScript. LS object lifetimes do not create the same native C-API handle-table exhaustion risk as Java/SSJS .recycle() leaks, so LotusScript rules are not part of this rubric or the Handle Exhaustion work list.</w:t>
       </w:r>
     </w:p>
     <w:p>

</xml_diff>